<commit_message>
one-hot encoding, refactor de metodos para DRY, mejoras documento
</commit_message>
<xml_diff>
--- a/docs/informe_f1_f2_grupo_5.docx
+++ b/docs/informe_f1_f2_grupo_5.docx
@@ -1003,7 +1003,7 @@
       <w:r>
         <w:fldChar w:fldCharType="separate"/>
       </w:r>
-      <w:hyperlink w:anchor="_Toc240223378" w:history="1">
+      <w:hyperlink w:anchor="_Toc240229216" w:history="1">
         <w:r>
           <w:rPr>
             <w:rStyle w:val="Hipervnculo"/>
@@ -1030,7 +1030,7 @@
             <w:noProof/>
             <w:webHidden/>
           </w:rPr>
-          <w:instrText xml:space="preserve"> PAGEREF _Toc240223378 \h </w:instrText>
+          <w:instrText xml:space="preserve"> PAGEREF _Toc240229216 \h </w:instrText>
         </w:r>
         <w:r>
           <w:rPr>
@@ -1078,7 +1078,7 @@
           <w14:ligatures w14:val="standardContextual"/>
         </w:rPr>
       </w:pPr>
-      <w:hyperlink w:anchor="_Toc240223379" w:history="1">
+      <w:hyperlink w:anchor="_Toc240229217" w:history="1">
         <w:r>
           <w:rPr>
             <w:rStyle w:val="Hipervnculo"/>
@@ -1105,7 +1105,7 @@
             <w:noProof/>
             <w:webHidden/>
           </w:rPr>
-          <w:instrText xml:space="preserve"> PAGEREF _Toc240223379 \h </w:instrText>
+          <w:instrText xml:space="preserve"> PAGEREF _Toc240229217 \h </w:instrText>
         </w:r>
         <w:r>
           <w:rPr>
@@ -1153,7 +1153,7 @@
           <w14:ligatures w14:val="standardContextual"/>
         </w:rPr>
       </w:pPr>
-      <w:hyperlink w:anchor="_Toc240223380" w:history="1">
+      <w:hyperlink w:anchor="_Toc240229218" w:history="1">
         <w:r>
           <w:rPr>
             <w:rStyle w:val="Hipervnculo"/>
@@ -1180,7 +1180,7 @@
             <w:noProof/>
             <w:webHidden/>
           </w:rPr>
-          <w:instrText xml:space="preserve"> PAGEREF _Toc240223380 \h </w:instrText>
+          <w:instrText xml:space="preserve"> PAGEREF _Toc240229218 \h </w:instrText>
         </w:r>
         <w:r>
           <w:rPr>
@@ -1228,7 +1228,7 @@
           <w14:ligatures w14:val="standardContextual"/>
         </w:rPr>
       </w:pPr>
-      <w:hyperlink w:anchor="_Toc240223381" w:history="1">
+      <w:hyperlink w:anchor="_Toc240229219" w:history="1">
         <w:r>
           <w:rPr>
             <w:rStyle w:val="Hipervnculo"/>
@@ -1255,7 +1255,7 @@
             <w:noProof/>
             <w:webHidden/>
           </w:rPr>
-          <w:instrText xml:space="preserve"> PAGEREF _Toc240223381 \h </w:instrText>
+          <w:instrText xml:space="preserve"> PAGEREF _Toc240229219 \h </w:instrText>
         </w:r>
         <w:r>
           <w:rPr>
@@ -1303,7 +1303,7 @@
           <w14:ligatures w14:val="standardContextual"/>
         </w:rPr>
       </w:pPr>
-      <w:hyperlink w:anchor="_Toc240223382" w:history="1">
+      <w:hyperlink w:anchor="_Toc240229220" w:history="1">
         <w:r>
           <w:rPr>
             <w:rStyle w:val="Hipervnculo"/>
@@ -1330,7 +1330,7 @@
             <w:noProof/>
             <w:webHidden/>
           </w:rPr>
-          <w:instrText xml:space="preserve"> PAGEREF _Toc240223382 \h </w:instrText>
+          <w:instrText xml:space="preserve"> PAGEREF _Toc240229220 \h </w:instrText>
         </w:r>
         <w:r>
           <w:rPr>
@@ -1378,7 +1378,7 @@
           <w14:ligatures w14:val="standardContextual"/>
         </w:rPr>
       </w:pPr>
-      <w:hyperlink w:anchor="_Toc240223383" w:history="1">
+      <w:hyperlink w:anchor="_Toc240229221" w:history="1">
         <w:r>
           <w:rPr>
             <w:rStyle w:val="Hipervnculo"/>
@@ -1405,7 +1405,7 @@
             <w:noProof/>
             <w:webHidden/>
           </w:rPr>
-          <w:instrText xml:space="preserve"> PAGEREF _Toc240223383 \h </w:instrText>
+          <w:instrText xml:space="preserve"> PAGEREF _Toc240229221 \h </w:instrText>
         </w:r>
         <w:r>
           <w:rPr>
@@ -1453,7 +1453,7 @@
           <w14:ligatures w14:val="standardContextual"/>
         </w:rPr>
       </w:pPr>
-      <w:hyperlink w:anchor="_Toc240223384" w:history="1">
+      <w:hyperlink w:anchor="_Toc240229222" w:history="1">
         <w:r>
           <w:rPr>
             <w:rStyle w:val="Hipervnculo"/>
@@ -1480,7 +1480,7 @@
             <w:noProof/>
             <w:webHidden/>
           </w:rPr>
-          <w:instrText xml:space="preserve"> PAGEREF _Toc240223384 \h </w:instrText>
+          <w:instrText xml:space="preserve"> PAGEREF _Toc240229222 \h </w:instrText>
         </w:r>
         <w:r>
           <w:rPr>
@@ -1528,7 +1528,7 @@
           <w14:ligatures w14:val="standardContextual"/>
         </w:rPr>
       </w:pPr>
-      <w:hyperlink w:anchor="_Toc240223385" w:history="1">
+      <w:hyperlink w:anchor="_Toc240229223" w:history="1">
         <w:r>
           <w:rPr>
             <w:rStyle w:val="Hipervnculo"/>
@@ -1555,7 +1555,7 @@
             <w:noProof/>
             <w:webHidden/>
           </w:rPr>
-          <w:instrText xml:space="preserve"> PAGEREF _Toc240223385 \h </w:instrText>
+          <w:instrText xml:space="preserve"> PAGEREF _Toc240229223 \h </w:instrText>
         </w:r>
         <w:r>
           <w:rPr>
@@ -1603,7 +1603,7 @@
           <w14:ligatures w14:val="standardContextual"/>
         </w:rPr>
       </w:pPr>
-      <w:hyperlink w:anchor="_Toc240223386" w:history="1">
+      <w:hyperlink w:anchor="_Toc240229224" w:history="1">
         <w:r>
           <w:rPr>
             <w:rStyle w:val="Hipervnculo"/>
@@ -1630,7 +1630,7 @@
             <w:noProof/>
             <w:webHidden/>
           </w:rPr>
-          <w:instrText xml:space="preserve"> PAGEREF _Toc240223386 \h </w:instrText>
+          <w:instrText xml:space="preserve"> PAGEREF _Toc240229224 \h </w:instrText>
         </w:r>
         <w:r>
           <w:rPr>
@@ -1678,7 +1678,7 @@
           <w14:ligatures w14:val="standardContextual"/>
         </w:rPr>
       </w:pPr>
-      <w:hyperlink w:anchor="_Toc240223387" w:history="1">
+      <w:hyperlink w:anchor="_Toc240229225" w:history="1">
         <w:r>
           <w:rPr>
             <w:rStyle w:val="Hipervnculo"/>
@@ -1705,7 +1705,7 @@
             <w:noProof/>
             <w:webHidden/>
           </w:rPr>
-          <w:instrText xml:space="preserve"> PAGEREF _Toc240223387 \h </w:instrText>
+          <w:instrText xml:space="preserve"> PAGEREF _Toc240229225 \h </w:instrText>
         </w:r>
         <w:r>
           <w:rPr>
@@ -1753,7 +1753,7 @@
           <w14:ligatures w14:val="standardContextual"/>
         </w:rPr>
       </w:pPr>
-      <w:hyperlink w:anchor="_Toc240223388" w:history="1">
+      <w:hyperlink w:anchor="_Toc240229226" w:history="1">
         <w:r>
           <w:rPr>
             <w:rStyle w:val="Hipervnculo"/>
@@ -1780,7 +1780,7 @@
             <w:noProof/>
             <w:webHidden/>
           </w:rPr>
-          <w:instrText xml:space="preserve"> PAGEREF _Toc240223388 \h </w:instrText>
+          <w:instrText xml:space="preserve"> PAGEREF _Toc240229226 \h </w:instrText>
         </w:r>
         <w:r>
           <w:rPr>
@@ -1828,7 +1828,7 @@
           <w14:ligatures w14:val="standardContextual"/>
         </w:rPr>
       </w:pPr>
-      <w:hyperlink w:anchor="_Toc240223389" w:history="1">
+      <w:hyperlink w:anchor="_Toc240229227" w:history="1">
         <w:r>
           <w:rPr>
             <w:rStyle w:val="Hipervnculo"/>
@@ -1855,7 +1855,7 @@
             <w:noProof/>
             <w:webHidden/>
           </w:rPr>
-          <w:instrText xml:space="preserve"> PAGEREF _Toc240223389 \h </w:instrText>
+          <w:instrText xml:space="preserve"> PAGEREF _Toc240229227 \h </w:instrText>
         </w:r>
         <w:r>
           <w:rPr>
@@ -1903,7 +1903,7 @@
           <w14:ligatures w14:val="standardContextual"/>
         </w:rPr>
       </w:pPr>
-      <w:hyperlink w:anchor="_Toc240223390" w:history="1">
+      <w:hyperlink w:anchor="_Toc240229228" w:history="1">
         <w:r>
           <w:rPr>
             <w:rStyle w:val="Hipervnculo"/>
@@ -1930,7 +1930,7 @@
             <w:noProof/>
             <w:webHidden/>
           </w:rPr>
-          <w:instrText xml:space="preserve"> PAGEREF _Toc240223390 \h </w:instrText>
+          <w:instrText xml:space="preserve"> PAGEREF _Toc240229228 \h </w:instrText>
         </w:r>
         <w:r>
           <w:rPr>
@@ -1978,7 +1978,7 @@
           <w14:ligatures w14:val="standardContextual"/>
         </w:rPr>
       </w:pPr>
-      <w:hyperlink w:anchor="_Toc240223391" w:history="1">
+      <w:hyperlink w:anchor="_Toc240229229" w:history="1">
         <w:r>
           <w:rPr>
             <w:rStyle w:val="Hipervnculo"/>
@@ -2005,7 +2005,7 @@
             <w:noProof/>
             <w:webHidden/>
           </w:rPr>
-          <w:instrText xml:space="preserve"> PAGEREF _Toc240223391 \h </w:instrText>
+          <w:instrText xml:space="preserve"> PAGEREF _Toc240229229 \h </w:instrText>
         </w:r>
         <w:r>
           <w:rPr>
@@ -2053,7 +2053,7 @@
           <w14:ligatures w14:val="standardContextual"/>
         </w:rPr>
       </w:pPr>
-      <w:hyperlink w:anchor="_Toc240223392" w:history="1">
+      <w:hyperlink w:anchor="_Toc240229230" w:history="1">
         <w:r>
           <w:rPr>
             <w:rStyle w:val="Hipervnculo"/>
@@ -2080,7 +2080,7 @@
             <w:noProof/>
             <w:webHidden/>
           </w:rPr>
-          <w:instrText xml:space="preserve"> PAGEREF _Toc240223392 \h </w:instrText>
+          <w:instrText xml:space="preserve"> PAGEREF _Toc240229230 \h </w:instrText>
         </w:r>
         <w:r>
           <w:rPr>
@@ -2128,7 +2128,7 @@
           <w14:ligatures w14:val="standardContextual"/>
         </w:rPr>
       </w:pPr>
-      <w:hyperlink w:anchor="_Toc240223393" w:history="1">
+      <w:hyperlink w:anchor="_Toc240229231" w:history="1">
         <w:r>
           <w:rPr>
             <w:rStyle w:val="Hipervnculo"/>
@@ -2155,7 +2155,7 @@
             <w:noProof/>
             <w:webHidden/>
           </w:rPr>
-          <w:instrText xml:space="preserve"> PAGEREF _Toc240223393 \h </w:instrText>
+          <w:instrText xml:space="preserve"> PAGEREF _Toc240229231 \h </w:instrText>
         </w:r>
         <w:r>
           <w:rPr>
@@ -2203,7 +2203,7 @@
           <w14:ligatures w14:val="standardContextual"/>
         </w:rPr>
       </w:pPr>
-      <w:hyperlink w:anchor="_Toc240223394" w:history="1">
+      <w:hyperlink w:anchor="_Toc240229232" w:history="1">
         <w:r>
           <w:rPr>
             <w:rStyle w:val="Hipervnculo"/>
@@ -2230,7 +2230,7 @@
             <w:noProof/>
             <w:webHidden/>
           </w:rPr>
-          <w:instrText xml:space="preserve"> PAGEREF _Toc240223394 \h </w:instrText>
+          <w:instrText xml:space="preserve"> PAGEREF _Toc240229232 \h </w:instrText>
         </w:r>
         <w:r>
           <w:rPr>
@@ -2278,7 +2278,7 @@
           <w14:ligatures w14:val="standardContextual"/>
         </w:rPr>
       </w:pPr>
-      <w:hyperlink w:anchor="_Toc240223395" w:history="1">
+      <w:hyperlink w:anchor="_Toc240229233" w:history="1">
         <w:r>
           <w:rPr>
             <w:rStyle w:val="Hipervnculo"/>
@@ -2305,7 +2305,7 @@
             <w:noProof/>
             <w:webHidden/>
           </w:rPr>
-          <w:instrText xml:space="preserve"> PAGEREF _Toc240223395 \h </w:instrText>
+          <w:instrText xml:space="preserve"> PAGEREF _Toc240229233 \h </w:instrText>
         </w:r>
         <w:r>
           <w:rPr>
@@ -2353,7 +2353,7 @@
           <w14:ligatures w14:val="standardContextual"/>
         </w:rPr>
       </w:pPr>
-      <w:hyperlink w:anchor="_Toc240223396" w:history="1">
+      <w:hyperlink w:anchor="_Toc240229234" w:history="1">
         <w:r>
           <w:rPr>
             <w:rStyle w:val="Hipervnculo"/>
@@ -2380,7 +2380,7 @@
             <w:noProof/>
             <w:webHidden/>
           </w:rPr>
-          <w:instrText xml:space="preserve"> PAGEREF _Toc240223396 \h </w:instrText>
+          <w:instrText xml:space="preserve"> PAGEREF _Toc240229234 \h </w:instrText>
         </w:r>
         <w:r>
           <w:rPr>
@@ -2430,7 +2430,7 @@
       <w:pPr>
         <w:pStyle w:val="Ttulo11"/>
       </w:pPr>
-      <w:bookmarkStart w:id="0" w:name="_Toc240223378"/>
+      <w:bookmarkStart w:id="0" w:name="_Toc240229216"/>
       <w:r>
         <w:lastRenderedPageBreak/>
         <w:t>I. Introducción y contextualización</w:t>
@@ -2465,7 +2465,7 @@
       <w:pPr>
         <w:pStyle w:val="Ttulo21"/>
       </w:pPr>
-      <w:bookmarkStart w:id="1" w:name="_Toc240223379"/>
+      <w:bookmarkStart w:id="1" w:name="_Toc240229217"/>
       <w:r>
         <w:t>Conexión explícita con las fases F1–F4 del proyecto</w:t>
       </w:r>
@@ -2489,7 +2489,7 @@
         <w:pStyle w:val="Listaconvietas1"/>
       </w:pPr>
       <w:r>
-        <w:t>Fase 2 (Implementada): Diagnóstico exploratorio de calidad de datos, desarrollo del pipeline modular de limpieza (exclusión de columnas nulas y neutralización de fechas centinela), transformaciones de tipos, validación técnica automatizada y exportación del dataset preprocesado a data/processed/.</w:t>
+        <w:t>Fase 2 (Implementada): Diagnóstico exploratorio de calidad de datos, desarrollo del pipeline modular de limpieza (exclusión de columnas nulas y neutralización de fechas anómalas año 1900), transformaciones de tipos, validación técnica automatizada y exportación del dataset preprocesado a data/processed/.</w:t>
       </w:r>
     </w:p>
     <w:p>
@@ -2517,7 +2517,7 @@
       <w:pPr>
         <w:pStyle w:val="Ttulo11"/>
       </w:pPr>
-      <w:bookmarkStart w:id="2" w:name="_Toc240223380"/>
+      <w:bookmarkStart w:id="2" w:name="_Toc240229218"/>
       <w:r>
         <w:lastRenderedPageBreak/>
         <w:t>II. Definición de la problemática y objetivos del proyecto</w:t>
@@ -2538,7 +2538,7 @@
       <w:pPr>
         <w:pStyle w:val="Ttulo21"/>
       </w:pPr>
-      <w:bookmarkStart w:id="3" w:name="_Toc240223381"/>
+      <w:bookmarkStart w:id="3" w:name="_Toc240229219"/>
       <w:r>
         <w:t>Preguntas específicas del estudio</w:t>
       </w:r>
@@ -2572,7 +2572,7 @@
       <w:pPr>
         <w:pStyle w:val="Ttulo21"/>
       </w:pPr>
-      <w:bookmarkStart w:id="4" w:name="_Toc240223382"/>
+      <w:bookmarkStart w:id="4" w:name="_Toc240229220"/>
       <w:r>
         <w:t>Objetivos del proyecto</w:t>
       </w:r>
@@ -2624,7 +2624,7 @@
       <w:pPr>
         <w:pStyle w:val="Ttulo21"/>
       </w:pPr>
-      <w:bookmarkStart w:id="5" w:name="_Toc240223383"/>
+      <w:bookmarkStart w:id="5" w:name="_Toc240229221"/>
       <w:r>
         <w:t>Alcance, restricciones y supuestos analíticos</w:t>
       </w:r>
@@ -2676,7 +2676,7 @@
       <w:pPr>
         <w:pStyle w:val="Ttulo11"/>
       </w:pPr>
-      <w:bookmarkStart w:id="6" w:name="_Toc240223384"/>
+      <w:bookmarkStart w:id="6" w:name="_Toc240229222"/>
       <w:r>
         <w:lastRenderedPageBreak/>
         <w:t>III. Herramientas científicas, reproducibilidad y control de versiones</w:t>
@@ -3264,7 +3264,7 @@
       <w:pPr>
         <w:pStyle w:val="Ttulo21"/>
       </w:pPr>
-      <w:bookmarkStart w:id="7" w:name="_Toc240223385"/>
+      <w:bookmarkStart w:id="7" w:name="_Toc240229223"/>
       <w:r>
         <w:t>Arquitectura modular y estructura del repositorio</w:t>
       </w:r>
@@ -3319,7 +3319,7 @@
       <w:pPr>
         <w:pStyle w:val="Ttulo21"/>
       </w:pPr>
-      <w:bookmarkStart w:id="8" w:name="_Toc240223386"/>
+      <w:bookmarkStart w:id="8" w:name="_Toc240229224"/>
       <w:r>
         <w:t>Gestión colaborativa y control de versiones</w:t>
       </w:r>
@@ -4068,7 +4068,7 @@
       <w:pPr>
         <w:pStyle w:val="Ttulo11"/>
       </w:pPr>
-      <w:bookmarkStart w:id="9" w:name="_Toc240223387"/>
+      <w:bookmarkStart w:id="9" w:name="_Toc240229225"/>
       <w:r>
         <w:lastRenderedPageBreak/>
         <w:t>IV. Diseño de soluciones algorítmicas, preprocesamiento y validación (F2)</w:t>
@@ -4084,7 +4084,7 @@
       <w:pPr>
         <w:pStyle w:val="Ttulo21"/>
       </w:pPr>
-      <w:bookmarkStart w:id="10" w:name="_Toc240223388"/>
+      <w:bookmarkStart w:id="10" w:name="_Toc240229226"/>
       <w:r>
         <w:t>A. Codificación funcional modular</w:t>
       </w:r>
@@ -4131,7 +4131,7 @@
       <w:pPr>
         <w:pStyle w:val="Ttulo21"/>
       </w:pPr>
-      <w:bookmarkStart w:id="11" w:name="_Toc240223389"/>
+      <w:bookmarkStart w:id="11" w:name="_Toc240229227"/>
       <w:r>
         <w:t>B. Preprocesamiento, transformaciones y tratamiento de NA</w:t>
       </w:r>
@@ -4469,7 +4469,7 @@
               <w:rPr>
                 <w:sz w:val="19"/>
               </w:rPr>
-              <w:t>Constituye un valor centinela por defecto del sistema origen; usarlo falsearía los plazos.</w:t>
+              <w:t>Son fechas anómalas por defecto del sistema origen (año 1900); utilizarlas distorsionaría el cómputo de plazos.</w:t>
             </w:r>
           </w:p>
         </w:tc>
@@ -4888,7 +4888,7 @@
       <w:pPr>
         <w:pStyle w:val="Ttulo21"/>
       </w:pPr>
-      <w:bookmarkStart w:id="12" w:name="_Toc240223390"/>
+      <w:bookmarkStart w:id="12" w:name="_Toc240229228"/>
       <w:r>
         <w:lastRenderedPageBreak/>
         <w:t>C. Validación técnica y verificación del código</w:t>
@@ -5447,7 +5447,7 @@
       <w:pPr>
         <w:pStyle w:val="Ttulo11"/>
       </w:pPr>
-      <w:bookmarkStart w:id="13" w:name="_Toc240223391"/>
+      <w:bookmarkStart w:id="13" w:name="_Toc240229229"/>
       <w:r>
         <w:lastRenderedPageBreak/>
         <w:t>V. Resultados preliminares de la preparación de datos (F1 y F2)</w:t>
@@ -5463,7 +5463,7 @@
       <w:pPr>
         <w:pStyle w:val="Ttulo21"/>
       </w:pPr>
-      <w:bookmarkStart w:id="14" w:name="_Toc240223392"/>
+      <w:bookmarkStart w:id="14" w:name="_Toc240229230"/>
       <w:r>
         <w:t>Tasa de adjudicación según tamaño de proveedor</w:t>
       </w:r>
@@ -6395,7 +6395,7 @@
       <w:pPr>
         <w:pStyle w:val="Ttulo21"/>
       </w:pPr>
-      <w:bookmarkStart w:id="15" w:name="_Toc240223393"/>
+      <w:bookmarkStart w:id="15" w:name="_Toc240229231"/>
       <w:r>
         <w:t>Distribución por tipo de licitación y plazos administrativos</w:t>
       </w:r>
@@ -6415,7 +6415,7 @@
       <w:pPr>
         <w:pStyle w:val="Ttulo11"/>
       </w:pPr>
-      <w:bookmarkStart w:id="16" w:name="_Toc240223394"/>
+      <w:bookmarkStart w:id="16" w:name="_Toc240229232"/>
       <w:r>
         <w:lastRenderedPageBreak/>
         <w:t>VI. Vinculación del mapa conceptual con el avance del proyecto</w:t>
@@ -6433,7 +6433,7 @@
           <w:noProof/>
         </w:rPr>
         <w:drawing>
-          <wp:inline distT="0" distB="0" distL="0" distR="0" wp14:anchorId="3638CCD1" wp14:editId="3C164179">
+          <wp:inline distT="0" distB="0" distL="0" distR="0" wp14:anchorId="45892221" wp14:editId="38EF35DD">
             <wp:extent cx="6492240" cy="2813304"/>
             <wp:effectExtent l="0" t="0" r="0" b="0"/>
             <wp:docPr id="12" name="Picture 12"/>
@@ -6916,7 +6916,7 @@
               <w:rPr>
                 <w:sz w:val="19"/>
               </w:rPr>
-              <w:t>Limpieza de NA, centinelas y transformaciones</w:t>
+              <w:t>Limpieza de NA, fechas anómalas y transformaciones</w:t>
             </w:r>
           </w:p>
         </w:tc>
@@ -7293,7 +7293,7 @@
       <w:pPr>
         <w:pStyle w:val="Ttulo11"/>
       </w:pPr>
-      <w:bookmarkStart w:id="17" w:name="_Toc240223395"/>
+      <w:bookmarkStart w:id="17" w:name="_Toc240229233"/>
       <w:r>
         <w:lastRenderedPageBreak/>
         <w:t>VII. Referencias bibliográficas (Normas APA 7.ª edición)</w:t>
@@ -7395,7 +7395,7 @@
       <w:pPr>
         <w:pStyle w:val="Ttulo11"/>
       </w:pPr>
-      <w:bookmarkStart w:id="18" w:name="_Toc240223396"/>
+      <w:bookmarkStart w:id="18" w:name="_Toc240229234"/>
       <w:r>
         <w:lastRenderedPageBreak/>
         <w:t>VIII. Anexos técnicos y trazabilidad criptográfica</w:t>
@@ -7836,7 +7836,7 @@
               <w:rPr>
                 <w:sz w:val="19"/>
               </w:rPr>
-              <w:t>ba06957bf296756f06b437e8516ce44b40843a7eb204f3500a22a9a732cfbf96</w:t>
+              <w:t>143a94be1a21bfb47b0a2760a2b9496cd4dc979e3be638d2a2d8fbf7bc0be80b</w:t>
             </w:r>
           </w:p>
         </w:tc>
@@ -7938,7 +7938,7 @@
               <w:rPr>
                 <w:sz w:val="19"/>
               </w:rPr>
-              <w:t>6d0c58564a2d1bd2a0175a1fc2017574f1fb77bbde0c5b9819aaf5bd0ae26c02</w:t>
+              <w:t>5ef3bb377ddba7cdf3b5c4bba6d76214c355be8a6fdb22d2433e3210879108e4</w:t>
             </w:r>
           </w:p>
         </w:tc>
@@ -8568,7 +8568,7 @@
               <wp:extent cx="6692900" cy="115570"/>
               <wp:effectExtent l="0" t="0" r="0" b="0"/>
               <wp:wrapNone/>
-              <wp:docPr id="253043878" name="Group 12"/>
+              <wp:docPr id="141863240" name="Group 12"/>
               <wp:cNvGraphicFramePr>
                 <a:graphicFrameLocks xmlns:a="http://schemas.openxmlformats.org/drawingml/2006/main"/>
               </wp:cNvGraphicFramePr>
@@ -10232,7 +10232,7 @@
     <w:autoRedefine/>
     <w:uiPriority w:val="39"/>
     <w:unhideWhenUsed/>
-    <w:rsid w:val="00E712A0"/>
+    <w:rsid w:val="00381F0F"/>
     <w:pPr>
       <w:spacing w:after="100"/>
     </w:pPr>
@@ -10244,7 +10244,7 @@
     <w:autoRedefine/>
     <w:uiPriority w:val="39"/>
     <w:unhideWhenUsed/>
-    <w:rsid w:val="00E712A0"/>
+    <w:rsid w:val="00381F0F"/>
     <w:pPr>
       <w:spacing w:after="100"/>
       <w:ind w:left="220"/>
@@ -10255,7 +10255,7 @@
     <w:basedOn w:val="Fuentedeprrafopredeter"/>
     <w:uiPriority w:val="99"/>
     <w:unhideWhenUsed/>
-    <w:rsid w:val="00E712A0"/>
+    <w:rsid w:val="00381F0F"/>
     <w:rPr>
       <w:color w:val="0000FF" w:themeColor="hyperlink"/>
       <w:u w:val="single"/>

</xml_diff>

<commit_message>
evidencias F2, mejoramiento introducción
</commit_message>
<xml_diff>
--- a/docs/informe_f1_f2_grupo_5.docx
+++ b/docs/informe_f1_f2_grupo_5.docx
@@ -12359,23 +12359,7 @@
           <w:szCs w:val="24"/>
         </w:rPr>
         <w:lastRenderedPageBreak/>
-        <w:t>definidas en src/proyecto.py y mantiene correspondencia con la planificación establecida en el mapa conceptual técnico. Su ejecución fue verificada bajo Python 3.12, registrándose 4 celdas ejecutadas y 0 errores, según la evidencia almacenada en</w:t>
-      </w:r>
-      <w:r>
-        <w:rPr>
-          <w:rFonts w:ascii="Arial" w:hAnsi="Arial"/>
-          <w:sz w:val="24"/>
-          <w:szCs w:val="24"/>
-        </w:rPr>
-        <w:t xml:space="preserve"> </w:t>
-      </w:r>
-      <w:r>
-        <w:rPr>
-          <w:rFonts w:ascii="Arial" w:hAnsi="Arial"/>
-          <w:sz w:val="24"/>
-          <w:szCs w:val="24"/>
-        </w:rPr>
-        <w:t>evidencias/F1_ejecucion.json.</w:t>
+        <w:t>definidas en src/proyecto.py y mantiene correspondencia con la planificación establecida en el mapa conceptual técnico. Su ejecución fue verificada bajo Python 3.12, registrándose 4 celdas ejecutadas y 0 errores, según la evidencia almacenada en evidencias/F1_ejecucion.json.</w:t>
       </w:r>
     </w:p>
     <w:p>
@@ -12398,6 +12382,7 @@
       <w:r>
         <w:rPr>
           <w:rFonts w:ascii="Arial" w:hAnsi="Arial"/>
+          <w:noProof/>
           <w:sz w:val="24"/>
           <w:szCs w:val="24"/>
         </w:rPr>
@@ -12449,6 +12434,7 @@
       <w:r>
         <w:rPr>
           <w:rFonts w:ascii="Arial" w:hAnsi="Arial"/>
+          <w:noProof/>
           <w:sz w:val="24"/>
           <w:szCs w:val="24"/>
         </w:rPr>
@@ -12500,132 +12486,22 @@
     </w:p>
     <w:p>
       <w:pPr>
-        <w:pStyle w:val="Ttulo2"/>
-        <w:rPr>
-          <w:rFonts w:ascii="Arial" w:hAnsi="Arial" w:cs="Arial"/>
-          <w:color w:val="auto"/>
-          <w:sz w:val="24"/>
-          <w:szCs w:val="24"/>
-          <w:lang w:val="es-CL"/>
-        </w:rPr>
-      </w:pPr>
-      <w:bookmarkStart w:id="18" w:name="_Toc240400492"/>
-      <w:r>
-        <w:rPr>
-          <w:rFonts w:ascii="Arial" w:hAnsi="Arial" w:cs="Arial"/>
-          <w:color w:val="auto"/>
-          <w:sz w:val="24"/>
-          <w:szCs w:val="24"/>
-          <w:lang w:val="es-CL"/>
-        </w:rPr>
-        <w:t>Evidencia del Notebook F2_Preprocesamiento.ipynb</w:t>
-      </w:r>
-      <w:bookmarkEnd w:id="18"/>
-    </w:p>
-    <w:p>
-      <w:pPr>
-        <w:rPr>
-          <w:rFonts w:ascii="Arial" w:hAnsi="Arial"/>
-          <w:sz w:val="24"/>
-          <w:szCs w:val="24"/>
-          <w:lang w:val="es-CL"/>
-        </w:rPr>
-      </w:pPr>
-    </w:p>
-    <w:p>
-      <w:pPr>
-        <w:rPr>
-          <w:rFonts w:ascii="Arial" w:hAnsi="Arial"/>
-          <w:sz w:val="24"/>
-          <w:szCs w:val="24"/>
-          <w:lang w:val="es-CL"/>
-        </w:rPr>
-      </w:pPr>
-      <w:r>
-        <w:rPr>
-          <w:rFonts w:ascii="Arial" w:hAnsi="Arial"/>
-          <w:sz w:val="24"/>
-          <w:szCs w:val="24"/>
-          <w:lang w:val="es-CL"/>
-        </w:rPr>
-        <w:t xml:space="preserve">El notebook F2/F2_Preprocesamiento.ipynb implementa el flujo técnico correspondiente a la Fase 2, incluyendo exploración inicial, diagnóstico de calidad, limpieza, tratamiento de valores nulos, transformación de variables, generación de atributos derivados y validación del </w:t>
-      </w:r>
-      <w:proofErr w:type="spellStart"/>
-      <w:r>
-        <w:rPr>
-          <w:rFonts w:ascii="Arial" w:hAnsi="Arial"/>
-          <w:sz w:val="24"/>
-          <w:szCs w:val="24"/>
-          <w:lang w:val="es-CL"/>
-        </w:rPr>
-        <w:t>dataset</w:t>
-      </w:r>
-      <w:proofErr w:type="spellEnd"/>
-      <w:r>
-        <w:rPr>
-          <w:rFonts w:ascii="Arial" w:hAnsi="Arial"/>
-          <w:sz w:val="24"/>
-          <w:szCs w:val="24"/>
-          <w:lang w:val="es-CL"/>
-        </w:rPr>
-        <w:t xml:space="preserve"> resultante. Cada etapa se encuentra documentada mediante celdas narrativas y resultados verificables, manteniendo trazabilidad con las funciones implementadas en </w:t>
-      </w:r>
-      <w:r>
-        <w:rPr>
-          <w:rFonts w:ascii="Arial" w:hAnsi="Arial"/>
-          <w:sz w:val="24"/>
-          <w:szCs w:val="24"/>
-          <w:lang w:val="es-CL"/>
+        <w:rPr>
+          <w:rFonts w:ascii="Arial" w:hAnsi="Arial"/>
+          <w:sz w:val="24"/>
+          <w:szCs w:val="24"/>
+        </w:rPr>
+      </w:pPr>
+      <w:r>
+        <w:rPr>
+          <w:rFonts w:ascii="Arial" w:hAnsi="Arial"/>
+          <w:noProof/>
+          <w:sz w:val="24"/>
+          <w:szCs w:val="24"/>
         </w:rPr>
         <w:lastRenderedPageBreak/>
-        <w:t>src/proyecto.py y con el conjunto de datos procesado generado en data/</w:t>
-      </w:r>
-      <w:proofErr w:type="spellStart"/>
-      <w:r>
-        <w:rPr>
-          <w:rFonts w:ascii="Arial" w:hAnsi="Arial"/>
-          <w:sz w:val="24"/>
-          <w:szCs w:val="24"/>
-          <w:lang w:val="es-CL"/>
-        </w:rPr>
-        <w:t>processed</w:t>
-      </w:r>
-      <w:proofErr w:type="spellEnd"/>
-      <w:r>
-        <w:rPr>
-          <w:rFonts w:ascii="Arial" w:hAnsi="Arial"/>
-          <w:sz w:val="24"/>
-          <w:szCs w:val="24"/>
-          <w:lang w:val="es-CL"/>
-        </w:rPr>
-        <w:t>/. Su ejecución fue verificada bajo Python 3.12, registrándose 9 celdas ejecutadas y 0 errores, de acuerdo con evidencias/F2_ejecucion.json.</w:t>
-      </w:r>
-    </w:p>
-    <w:p>
-      <w:pPr>
-        <w:rPr>
-          <w:rFonts w:ascii="Arial" w:hAnsi="Arial"/>
-          <w:sz w:val="24"/>
-          <w:szCs w:val="24"/>
-        </w:rPr>
-      </w:pPr>
-    </w:p>
-    <w:p>
-      <w:pPr>
-        <w:rPr>
-          <w:rFonts w:ascii="Arial" w:hAnsi="Arial"/>
-          <w:sz w:val="24"/>
-          <w:szCs w:val="24"/>
-        </w:rPr>
-      </w:pPr>
-      <w:r>
-        <w:rPr>
-          <w:rFonts w:ascii="Arial" w:hAnsi="Arial"/>
-          <w:sz w:val="24"/>
-          <w:szCs w:val="24"/>
-        </w:rPr>
         <w:drawing>
-          <wp:inline distT="0" distB="0" distL="0" distR="0" wp14:anchorId="227A1648" wp14:editId="3BF68065">
+          <wp:inline distT="0" distB="0" distL="0" distR="0" wp14:anchorId="18A27287" wp14:editId="6D77F462">
             <wp:extent cx="6309360" cy="2339340"/>
             <wp:effectExtent l="0" t="0" r="0" b="3810"/>
             <wp:docPr id="2108932311" name="Imagen 1"/>
@@ -12672,6 +12548,459 @@
     </w:p>
     <w:p>
       <w:pPr>
+        <w:pStyle w:val="Ttulo2"/>
+        <w:rPr>
+          <w:rFonts w:ascii="Arial" w:hAnsi="Arial" w:cs="Arial"/>
+          <w:color w:val="auto"/>
+          <w:sz w:val="24"/>
+          <w:szCs w:val="24"/>
+          <w:lang w:val="es-CL"/>
+        </w:rPr>
+      </w:pPr>
+      <w:bookmarkStart w:id="18" w:name="_Toc240400492"/>
+      <w:r>
+        <w:rPr>
+          <w:rFonts w:ascii="Arial" w:hAnsi="Arial" w:cs="Arial"/>
+          <w:color w:val="auto"/>
+          <w:sz w:val="24"/>
+          <w:szCs w:val="24"/>
+          <w:lang w:val="es-CL"/>
+        </w:rPr>
+        <w:t>Evidencia del Notebook F2_Preprocesamiento.ipynb</w:t>
+      </w:r>
+      <w:bookmarkEnd w:id="18"/>
+    </w:p>
+    <w:p>
+      <w:pPr>
+        <w:rPr>
+          <w:rFonts w:ascii="Arial" w:hAnsi="Arial"/>
+          <w:sz w:val="24"/>
+          <w:szCs w:val="24"/>
+          <w:lang w:val="es-CL"/>
+        </w:rPr>
+      </w:pPr>
+    </w:p>
+    <w:p>
+      <w:pPr>
+        <w:rPr>
+          <w:rFonts w:ascii="Arial" w:hAnsi="Arial"/>
+          <w:sz w:val="24"/>
+          <w:szCs w:val="24"/>
+          <w:lang w:val="es-CL"/>
+        </w:rPr>
+      </w:pPr>
+      <w:r>
+        <w:rPr>
+          <w:rFonts w:ascii="Arial" w:hAnsi="Arial"/>
+          <w:sz w:val="24"/>
+          <w:szCs w:val="24"/>
+          <w:lang w:val="es-CL"/>
+        </w:rPr>
+        <w:t xml:space="preserve">El notebook F2/F2_Preprocesamiento.ipynb implementa el flujo técnico correspondiente a la Fase 2, incluyendo exploración inicial, diagnóstico de calidad, limpieza, tratamiento de valores nulos, transformación de variables, generación de atributos derivados y validación del </w:t>
+      </w:r>
+      <w:proofErr w:type="spellStart"/>
+      <w:r>
+        <w:rPr>
+          <w:rFonts w:ascii="Arial" w:hAnsi="Arial"/>
+          <w:sz w:val="24"/>
+          <w:szCs w:val="24"/>
+          <w:lang w:val="es-CL"/>
+        </w:rPr>
+        <w:t>dataset</w:t>
+      </w:r>
+      <w:proofErr w:type="spellEnd"/>
+      <w:r>
+        <w:rPr>
+          <w:rFonts w:ascii="Arial" w:hAnsi="Arial"/>
+          <w:sz w:val="24"/>
+          <w:szCs w:val="24"/>
+          <w:lang w:val="es-CL"/>
+        </w:rPr>
+        <w:t xml:space="preserve"> resultante. Cada etapa se encuentra documentada mediante celdas narrativas y resultados verificables, manteniendo trazabilidad con las funciones implementadas en src/proyecto.py y con el conjunto de datos procesado generado en data/</w:t>
+      </w:r>
+      <w:proofErr w:type="spellStart"/>
+      <w:r>
+        <w:rPr>
+          <w:rFonts w:ascii="Arial" w:hAnsi="Arial"/>
+          <w:sz w:val="24"/>
+          <w:szCs w:val="24"/>
+          <w:lang w:val="es-CL"/>
+        </w:rPr>
+        <w:t>processed</w:t>
+      </w:r>
+      <w:proofErr w:type="spellEnd"/>
+      <w:r>
+        <w:rPr>
+          <w:rFonts w:ascii="Arial" w:hAnsi="Arial"/>
+          <w:sz w:val="24"/>
+          <w:szCs w:val="24"/>
+          <w:lang w:val="es-CL"/>
+        </w:rPr>
+        <w:t>/. Su ejecución fue verificada bajo Python 3.12, registrándose 9 celdas ejecutadas y 0 errores, de acuerdo con evidencias/F2_ejecucion.json.</w:t>
+      </w:r>
+    </w:p>
+    <w:p>
+      <w:pPr>
+        <w:rPr>
+          <w:rFonts w:ascii="Arial" w:hAnsi="Arial"/>
+          <w:sz w:val="24"/>
+          <w:szCs w:val="24"/>
+        </w:rPr>
+      </w:pPr>
+      <w:r>
+        <w:rPr>
+          <w:rFonts w:ascii="Arial" w:hAnsi="Arial"/>
+          <w:sz w:val="24"/>
+          <w:szCs w:val="24"/>
+        </w:rPr>
+        <w:drawing>
+          <wp:inline distT="0" distB="0" distL="0" distR="0" wp14:anchorId="4A0CC96F" wp14:editId="466DBFEC">
+            <wp:extent cx="6309360" cy="2024380"/>
+            <wp:effectExtent l="0" t="0" r="0" b="0"/>
+            <wp:docPr id="46181128" name="Imagen 1"/>
+            <wp:cNvGraphicFramePr>
+              <a:graphicFrameLocks xmlns:a="http://schemas.openxmlformats.org/drawingml/2006/main" noChangeAspect="1"/>
+            </wp:cNvGraphicFramePr>
+            <a:graphic xmlns:a="http://schemas.openxmlformats.org/drawingml/2006/main">
+              <a:graphicData uri="http://schemas.openxmlformats.org/drawingml/2006/picture">
+                <pic:pic xmlns:pic="http://schemas.openxmlformats.org/drawingml/2006/picture">
+                  <pic:nvPicPr>
+                    <pic:cNvPr id="46181128" name=""/>
+                    <pic:cNvPicPr/>
+                  </pic:nvPicPr>
+                  <pic:blipFill>
+                    <a:blip r:embed="rId25"/>
+                    <a:stretch>
+                      <a:fillRect/>
+                    </a:stretch>
+                  </pic:blipFill>
+                  <pic:spPr>
+                    <a:xfrm>
+                      <a:off x="0" y="0"/>
+                      <a:ext cx="6309360" cy="2024380"/>
+                    </a:xfrm>
+                    <a:prstGeom prst="rect">
+                      <a:avLst/>
+                    </a:prstGeom>
+                  </pic:spPr>
+                </pic:pic>
+              </a:graphicData>
+            </a:graphic>
+          </wp:inline>
+        </w:drawing>
+      </w:r>
+    </w:p>
+    <w:p>
+      <w:pPr>
+        <w:rPr>
+          <w:rFonts w:ascii="Arial" w:hAnsi="Arial"/>
+          <w:sz w:val="24"/>
+          <w:szCs w:val="24"/>
+        </w:rPr>
+      </w:pPr>
+      <w:r>
+        <w:rPr>
+          <w:rFonts w:ascii="Arial" w:hAnsi="Arial"/>
+          <w:sz w:val="24"/>
+          <w:szCs w:val="24"/>
+        </w:rPr>
+        <w:lastRenderedPageBreak/>
+        <w:drawing>
+          <wp:inline distT="0" distB="0" distL="0" distR="0" wp14:anchorId="15F6FF1B" wp14:editId="1B1ADAD9">
+            <wp:extent cx="6309360" cy="2760980"/>
+            <wp:effectExtent l="0" t="0" r="0" b="1270"/>
+            <wp:docPr id="1419282775" name="Imagen 1"/>
+            <wp:cNvGraphicFramePr>
+              <a:graphicFrameLocks xmlns:a="http://schemas.openxmlformats.org/drawingml/2006/main" noChangeAspect="1"/>
+            </wp:cNvGraphicFramePr>
+            <a:graphic xmlns:a="http://schemas.openxmlformats.org/drawingml/2006/main">
+              <a:graphicData uri="http://schemas.openxmlformats.org/drawingml/2006/picture">
+                <pic:pic xmlns:pic="http://schemas.openxmlformats.org/drawingml/2006/picture">
+                  <pic:nvPicPr>
+                    <pic:cNvPr id="1419282775" name=""/>
+                    <pic:cNvPicPr/>
+                  </pic:nvPicPr>
+                  <pic:blipFill>
+                    <a:blip r:embed="rId26"/>
+                    <a:stretch>
+                      <a:fillRect/>
+                    </a:stretch>
+                  </pic:blipFill>
+                  <pic:spPr>
+                    <a:xfrm>
+                      <a:off x="0" y="0"/>
+                      <a:ext cx="6309360" cy="2760980"/>
+                    </a:xfrm>
+                    <a:prstGeom prst="rect">
+                      <a:avLst/>
+                    </a:prstGeom>
+                  </pic:spPr>
+                </pic:pic>
+              </a:graphicData>
+            </a:graphic>
+          </wp:inline>
+        </w:drawing>
+      </w:r>
+    </w:p>
+    <w:p>
+      <w:pPr>
+        <w:rPr>
+          <w:rFonts w:ascii="Arial" w:hAnsi="Arial"/>
+          <w:sz w:val="24"/>
+          <w:szCs w:val="24"/>
+        </w:rPr>
+      </w:pPr>
+      <w:r>
+        <w:rPr>
+          <w:rFonts w:ascii="Arial" w:hAnsi="Arial"/>
+          <w:sz w:val="24"/>
+          <w:szCs w:val="24"/>
+        </w:rPr>
+        <w:drawing>
+          <wp:inline distT="0" distB="0" distL="0" distR="0" wp14:anchorId="4B98867A" wp14:editId="5FB4A300">
+            <wp:extent cx="6309360" cy="2735580"/>
+            <wp:effectExtent l="0" t="0" r="0" b="7620"/>
+            <wp:docPr id="1618014674" name="Imagen 1"/>
+            <wp:cNvGraphicFramePr>
+              <a:graphicFrameLocks xmlns:a="http://schemas.openxmlformats.org/drawingml/2006/main" noChangeAspect="1"/>
+            </wp:cNvGraphicFramePr>
+            <a:graphic xmlns:a="http://schemas.openxmlformats.org/drawingml/2006/main">
+              <a:graphicData uri="http://schemas.openxmlformats.org/drawingml/2006/picture">
+                <pic:pic xmlns:pic="http://schemas.openxmlformats.org/drawingml/2006/picture">
+                  <pic:nvPicPr>
+                    <pic:cNvPr id="1618014674" name=""/>
+                    <pic:cNvPicPr/>
+                  </pic:nvPicPr>
+                  <pic:blipFill>
+                    <a:blip r:embed="rId27"/>
+                    <a:stretch>
+                      <a:fillRect/>
+                    </a:stretch>
+                  </pic:blipFill>
+                  <pic:spPr>
+                    <a:xfrm>
+                      <a:off x="0" y="0"/>
+                      <a:ext cx="6309360" cy="2735580"/>
+                    </a:xfrm>
+                    <a:prstGeom prst="rect">
+                      <a:avLst/>
+                    </a:prstGeom>
+                  </pic:spPr>
+                </pic:pic>
+              </a:graphicData>
+            </a:graphic>
+          </wp:inline>
+        </w:drawing>
+      </w:r>
+    </w:p>
+    <w:p>
+      <w:pPr>
+        <w:rPr>
+          <w:rFonts w:ascii="Arial" w:hAnsi="Arial"/>
+          <w:sz w:val="24"/>
+          <w:szCs w:val="24"/>
+        </w:rPr>
+      </w:pPr>
+      <w:r>
+        <w:rPr>
+          <w:rFonts w:ascii="Arial" w:hAnsi="Arial"/>
+          <w:sz w:val="24"/>
+          <w:szCs w:val="24"/>
+        </w:rPr>
+        <w:drawing>
+          <wp:inline distT="0" distB="0" distL="0" distR="0" wp14:anchorId="1CAB12DD" wp14:editId="690A3979">
+            <wp:extent cx="6309360" cy="2755265"/>
+            <wp:effectExtent l="0" t="0" r="0" b="6985"/>
+            <wp:docPr id="1769231923" name="Imagen 1"/>
+            <wp:cNvGraphicFramePr>
+              <a:graphicFrameLocks xmlns:a="http://schemas.openxmlformats.org/drawingml/2006/main" noChangeAspect="1"/>
+            </wp:cNvGraphicFramePr>
+            <a:graphic xmlns:a="http://schemas.openxmlformats.org/drawingml/2006/main">
+              <a:graphicData uri="http://schemas.openxmlformats.org/drawingml/2006/picture">
+                <pic:pic xmlns:pic="http://schemas.openxmlformats.org/drawingml/2006/picture">
+                  <pic:nvPicPr>
+                    <pic:cNvPr id="1769231923" name=""/>
+                    <pic:cNvPicPr/>
+                  </pic:nvPicPr>
+                  <pic:blipFill>
+                    <a:blip r:embed="rId28"/>
+                    <a:stretch>
+                      <a:fillRect/>
+                    </a:stretch>
+                  </pic:blipFill>
+                  <pic:spPr>
+                    <a:xfrm>
+                      <a:off x="0" y="0"/>
+                      <a:ext cx="6309360" cy="2755265"/>
+                    </a:xfrm>
+                    <a:prstGeom prst="rect">
+                      <a:avLst/>
+                    </a:prstGeom>
+                  </pic:spPr>
+                </pic:pic>
+              </a:graphicData>
+            </a:graphic>
+          </wp:inline>
+        </w:drawing>
+      </w:r>
+    </w:p>
+    <w:p>
+      <w:pPr>
+        <w:rPr>
+          <w:rFonts w:ascii="Arial" w:hAnsi="Arial"/>
+          <w:sz w:val="24"/>
+          <w:szCs w:val="24"/>
+        </w:rPr>
+      </w:pPr>
+      <w:r>
+        <w:rPr>
+          <w:rFonts w:ascii="Arial" w:hAnsi="Arial"/>
+          <w:sz w:val="24"/>
+          <w:szCs w:val="24"/>
+        </w:rPr>
+        <w:lastRenderedPageBreak/>
+        <w:drawing>
+          <wp:inline distT="0" distB="0" distL="0" distR="0" wp14:anchorId="679D6332" wp14:editId="6B36F531">
+            <wp:extent cx="6309360" cy="2324100"/>
+            <wp:effectExtent l="0" t="0" r="0" b="0"/>
+            <wp:docPr id="439249247" name="Imagen 1"/>
+            <wp:cNvGraphicFramePr>
+              <a:graphicFrameLocks xmlns:a="http://schemas.openxmlformats.org/drawingml/2006/main" noChangeAspect="1"/>
+            </wp:cNvGraphicFramePr>
+            <a:graphic xmlns:a="http://schemas.openxmlformats.org/drawingml/2006/main">
+              <a:graphicData uri="http://schemas.openxmlformats.org/drawingml/2006/picture">
+                <pic:pic xmlns:pic="http://schemas.openxmlformats.org/drawingml/2006/picture">
+                  <pic:nvPicPr>
+                    <pic:cNvPr id="439249247" name=""/>
+                    <pic:cNvPicPr/>
+                  </pic:nvPicPr>
+                  <pic:blipFill>
+                    <a:blip r:embed="rId29"/>
+                    <a:stretch>
+                      <a:fillRect/>
+                    </a:stretch>
+                  </pic:blipFill>
+                  <pic:spPr>
+                    <a:xfrm>
+                      <a:off x="0" y="0"/>
+                      <a:ext cx="6309360" cy="2324100"/>
+                    </a:xfrm>
+                    <a:prstGeom prst="rect">
+                      <a:avLst/>
+                    </a:prstGeom>
+                  </pic:spPr>
+                </pic:pic>
+              </a:graphicData>
+            </a:graphic>
+          </wp:inline>
+        </w:drawing>
+      </w:r>
+    </w:p>
+    <w:p>
+      <w:pPr>
+        <w:rPr>
+          <w:rFonts w:ascii="Arial" w:hAnsi="Arial"/>
+          <w:sz w:val="24"/>
+          <w:szCs w:val="24"/>
+        </w:rPr>
+      </w:pPr>
+      <w:r>
+        <w:rPr>
+          <w:rFonts w:ascii="Arial" w:hAnsi="Arial"/>
+          <w:sz w:val="24"/>
+          <w:szCs w:val="24"/>
+        </w:rPr>
+        <w:drawing>
+          <wp:inline distT="0" distB="0" distL="0" distR="0" wp14:anchorId="1227C221" wp14:editId="1C5F40E6">
+            <wp:extent cx="6309360" cy="3020695"/>
+            <wp:effectExtent l="0" t="0" r="0" b="8255"/>
+            <wp:docPr id="720305394" name="Imagen 1"/>
+            <wp:cNvGraphicFramePr>
+              <a:graphicFrameLocks xmlns:a="http://schemas.openxmlformats.org/drawingml/2006/main" noChangeAspect="1"/>
+            </wp:cNvGraphicFramePr>
+            <a:graphic xmlns:a="http://schemas.openxmlformats.org/drawingml/2006/main">
+              <a:graphicData uri="http://schemas.openxmlformats.org/drawingml/2006/picture">
+                <pic:pic xmlns:pic="http://schemas.openxmlformats.org/drawingml/2006/picture">
+                  <pic:nvPicPr>
+                    <pic:cNvPr id="720305394" name=""/>
+                    <pic:cNvPicPr/>
+                  </pic:nvPicPr>
+                  <pic:blipFill>
+                    <a:blip r:embed="rId30"/>
+                    <a:stretch>
+                      <a:fillRect/>
+                    </a:stretch>
+                  </pic:blipFill>
+                  <pic:spPr>
+                    <a:xfrm>
+                      <a:off x="0" y="0"/>
+                      <a:ext cx="6309360" cy="3020695"/>
+                    </a:xfrm>
+                    <a:prstGeom prst="rect">
+                      <a:avLst/>
+                    </a:prstGeom>
+                  </pic:spPr>
+                </pic:pic>
+              </a:graphicData>
+            </a:graphic>
+          </wp:inline>
+        </w:drawing>
+      </w:r>
+    </w:p>
+    <w:p>
+      <w:pPr>
+        <w:rPr>
+          <w:rFonts w:ascii="Arial" w:hAnsi="Arial"/>
+          <w:sz w:val="24"/>
+          <w:szCs w:val="24"/>
+        </w:rPr>
+      </w:pPr>
+      <w:r>
+        <w:rPr>
+          <w:rFonts w:ascii="Arial" w:hAnsi="Arial"/>
+          <w:sz w:val="24"/>
+          <w:szCs w:val="24"/>
+        </w:rPr>
+        <w:lastRenderedPageBreak/>
+        <w:drawing>
+          <wp:inline distT="0" distB="0" distL="0" distR="0" wp14:anchorId="74D7C827" wp14:editId="4C299B76">
+            <wp:extent cx="6309360" cy="5414010"/>
+            <wp:effectExtent l="0" t="0" r="0" b="0"/>
+            <wp:docPr id="544759959" name="Imagen 1"/>
+            <wp:cNvGraphicFramePr>
+              <a:graphicFrameLocks xmlns:a="http://schemas.openxmlformats.org/drawingml/2006/main" noChangeAspect="1"/>
+            </wp:cNvGraphicFramePr>
+            <a:graphic xmlns:a="http://schemas.openxmlformats.org/drawingml/2006/main">
+              <a:graphicData uri="http://schemas.openxmlformats.org/drawingml/2006/picture">
+                <pic:pic xmlns:pic="http://schemas.openxmlformats.org/drawingml/2006/picture">
+                  <pic:nvPicPr>
+                    <pic:cNvPr id="544759959" name=""/>
+                    <pic:cNvPicPr/>
+                  </pic:nvPicPr>
+                  <pic:blipFill>
+                    <a:blip r:embed="rId31"/>
+                    <a:stretch>
+                      <a:fillRect/>
+                    </a:stretch>
+                  </pic:blipFill>
+                  <pic:spPr>
+                    <a:xfrm>
+                      <a:off x="0" y="0"/>
+                      <a:ext cx="6309360" cy="5414010"/>
+                    </a:xfrm>
+                    <a:prstGeom prst="rect">
+                      <a:avLst/>
+                    </a:prstGeom>
+                  </pic:spPr>
+                </pic:pic>
+              </a:graphicData>
+            </a:graphic>
+          </wp:inline>
+        </w:drawing>
+      </w:r>
+    </w:p>
+    <w:p>
+      <w:pPr>
         <w:rPr>
           <w:rFonts w:ascii="Arial" w:hAnsi="Arial"/>
           <w:sz w:val="24"/>
@@ -12858,6 +13187,7 @@
           <w:sz w:val="24"/>
           <w:szCs w:val="24"/>
         </w:rPr>
+        <w:lastRenderedPageBreak/>
         <w:drawing>
           <wp:inline distT="0" distB="0" distL="0" distR="0" wp14:anchorId="45892221" wp14:editId="38EF35DD">
             <wp:extent cx="6492240" cy="2813304"/>
@@ -12874,7 +13204,7 @@
                     <pic:cNvPicPr/>
                   </pic:nvPicPr>
                   <pic:blipFill>
-                    <a:blip r:embed="rId25"/>
+                    <a:blip r:embed="rId32"/>
                     <a:stretch>
                       <a:fillRect/>
                     </a:stretch>
@@ -12906,6 +13236,18 @@
           <w:szCs w:val="24"/>
         </w:rPr>
       </w:pPr>
+    </w:p>
+    <w:p>
+      <w:pPr>
+        <w:pStyle w:val="Descripcin1"/>
+        <w:jc w:val="both"/>
+        <w:rPr>
+          <w:rFonts w:ascii="Arial" w:hAnsi="Arial" w:cs="Arial"/>
+          <w:color w:val="auto"/>
+          <w:sz w:val="24"/>
+          <w:szCs w:val="24"/>
+        </w:rPr>
+      </w:pPr>
       <w:proofErr w:type="spellStart"/>
       <w:r>
         <w:rPr>
@@ -13106,6 +13448,18 @@
         </w:rPr>
         <w:t xml:space="preserve"> docs/mapa_conceptual_f1_f2.drawio.</w:t>
       </w:r>
+    </w:p>
+    <w:p>
+      <w:pPr>
+        <w:pStyle w:val="Descripcin1"/>
+        <w:jc w:val="both"/>
+        <w:rPr>
+          <w:rFonts w:ascii="Arial" w:hAnsi="Arial" w:cs="Arial"/>
+          <w:color w:val="auto"/>
+          <w:sz w:val="24"/>
+          <w:szCs w:val="24"/>
+        </w:rPr>
+      </w:pPr>
     </w:p>
     <w:tbl>
       <w:tblPr>
@@ -13164,7 +13518,6 @@
                 <w:sz w:val="24"/>
                 <w:szCs w:val="24"/>
               </w:rPr>
-              <w:lastRenderedPageBreak/>
               <w:t>Componente del Mapa Conceptual</w:t>
             </w:r>
           </w:p>
@@ -14005,6 +14358,7 @@
                 <w:sz w:val="24"/>
                 <w:szCs w:val="24"/>
               </w:rPr>
+              <w:lastRenderedPageBreak/>
               <w:t>Evidencias de ejecución sin errores</w:t>
             </w:r>
           </w:p>
@@ -16581,8 +16935,8 @@
       </w:pPr>
     </w:p>
     <w:sectPr>
-      <w:headerReference w:type="default" r:id="rId26"/>
-      <w:footerReference w:type="default" r:id="rId27"/>
+      <w:headerReference w:type="default" r:id="rId33"/>
+      <w:footerReference w:type="default" r:id="rId34"/>
       <w:pgSz w:w="12240" w:h="15840"/>
       <w:pgMar w:top="1152" w:right="1152" w:bottom="1296" w:left="1152" w:header="432" w:footer="576" w:gutter="0"/>
       <w:cols w:space="720"/>
@@ -18400,6 +18754,7 @@
   <w:style w:type="character" w:default="1" w:styleId="Fuentedeprrafopredeter">
     <w:name w:val="Default Paragraph Font"/>
     <w:uiPriority w:val="1"/>
+    <w:semiHidden/>
     <w:unhideWhenUsed/>
   </w:style>
   <w:style w:type="table" w:default="1" w:styleId="Tablanormal">
@@ -18951,10 +19306,6 @@
 </file>
 
 <file path=customXml/item1.xml><?xml version="1.0" encoding="utf-8"?>
-<b:Sources xmlns:b="http://schemas.openxmlformats.org/officeDocument/2006/bibliography" xmlns="http://schemas.openxmlformats.org/officeDocument/2006/bibliography" SelectedStyle="\APASixthEditionOfficeOnline.xsl" StyleName="APA" Version="6"/>
-</file>
-
-<file path=customXml/item2.xml><?xml version="1.0" encoding="utf-8"?>
 <?mso-contentType ?>
 <FormTemplates xmlns="http://schemas.microsoft.com/sharepoint/v3/contenttype/forms">
   <Display>DocumentLibraryForm</Display>
@@ -18963,7 +19314,40 @@
 </FormTemplates>
 </file>
 
+<file path=customXml/item2.xml><?xml version="1.0" encoding="utf-8"?>
+<b:Sources xmlns:b="http://schemas.openxmlformats.org/officeDocument/2006/bibliography" xmlns="http://schemas.openxmlformats.org/officeDocument/2006/bibliography" SelectedStyle="\APASixthEditionOfficeOnline.xsl" StyleName="APA" Version="6"/>
+</file>
+
 <file path=customXml/item3.xml><?xml version="1.0" encoding="utf-8"?>
+<p:properties xmlns:p="http://schemas.microsoft.com/office/2006/metadata/properties" xmlns:xsi="http://www.w3.org/2001/XMLSchema-instance" xmlns:pc="http://schemas.microsoft.com/office/infopath/2007/PartnerControls">
+  <documentManagement>
+    <_ApprovalAssignedTo xmlns="0a2fff00-f002-44e7-b50c-b90cb65110b9">
+      <UserInfo>
+        <DisplayName/>
+        <AccountId xsi:nil="true"/>
+        <AccountType/>
+      </UserInfo>
+    </_ApprovalAssignedTo>
+    <_ApprovalStatus xmlns="0a2fff00-f002-44e7-b50c-b90cb65110b9">0</_ApprovalStatus>
+    <_ApprovalRespondedBy xmlns="0a2fff00-f002-44e7-b50c-b90cb65110b9">
+      <UserInfo>
+        <DisplayName/>
+        <AccountId xsi:nil="true"/>
+        <AccountType/>
+      </UserInfo>
+    </_ApprovalRespondedBy>
+    <_ApprovalSentBy xmlns="0a2fff00-f002-44e7-b50c-b90cb65110b9">
+      <UserInfo>
+        <DisplayName/>
+        <AccountId xsi:nil="true"/>
+        <AccountType/>
+      </UserInfo>
+    </_ApprovalSentBy>
+  </documentManagement>
+</p:properties>
+</file>
+
+<file path=customXml/item4.xml><?xml version="1.0" encoding="utf-8"?>
 <ct:contentTypeSchema xmlns:ct="http://schemas.microsoft.com/office/2006/metadata/contentType" xmlns:ma="http://schemas.microsoft.com/office/2006/metadata/properties/metaAttributes" ct:_="" ma:_="" ma:contentTypeName="Documento" ma:contentTypeID="0x010100E4D0EA28D091FE4192BEFA8519B37564" ma:contentTypeVersion="7" ma:contentTypeDescription="Crear nuevo documento." ma:contentTypeScope="" ma:versionID="8260c90b1ed25191c73397d710d0b300">
   <xsd:schema xmlns:xsd="http://www.w3.org/2001/XMLSchema" xmlns:xs="http://www.w3.org/2001/XMLSchema" xmlns:p="http://schemas.microsoft.com/office/2006/metadata/properties" xmlns:ns2="0a2fff00-f002-44e7-b50c-b90cb65110b9" targetNamespace="http://schemas.microsoft.com/office/2006/metadata/properties" ma:root="true" ma:fieldsID="0fcc4b40ac5a1efab0a1fc825461417d" ns2:_="">
     <xsd:import namespace="0a2fff00-f002-44e7-b50c-b90cb65110b9"/>
@@ -19167,36 +19551,15 @@
 </ct:contentTypeSchema>
 </file>
 
-<file path=customXml/item4.xml><?xml version="1.0" encoding="utf-8"?>
-<p:properties xmlns:p="http://schemas.microsoft.com/office/2006/metadata/properties" xmlns:xsi="http://www.w3.org/2001/XMLSchema-instance" xmlns:pc="http://schemas.microsoft.com/office/infopath/2007/PartnerControls">
-  <documentManagement>
-    <_ApprovalAssignedTo xmlns="0a2fff00-f002-44e7-b50c-b90cb65110b9">
-      <UserInfo>
-        <DisplayName/>
-        <AccountId xsi:nil="true"/>
-        <AccountType/>
-      </UserInfo>
-    </_ApprovalAssignedTo>
-    <_ApprovalStatus xmlns="0a2fff00-f002-44e7-b50c-b90cb65110b9">0</_ApprovalStatus>
-    <_ApprovalRespondedBy xmlns="0a2fff00-f002-44e7-b50c-b90cb65110b9">
-      <UserInfo>
-        <DisplayName/>
-        <AccountId xsi:nil="true"/>
-        <AccountType/>
-      </UserInfo>
-    </_ApprovalRespondedBy>
-    <_ApprovalSentBy xmlns="0a2fff00-f002-44e7-b50c-b90cb65110b9">
-      <UserInfo>
-        <DisplayName/>
-        <AccountId xsi:nil="true"/>
-        <AccountType/>
-      </UserInfo>
-    </_ApprovalSentBy>
-  </documentManagement>
-</p:properties>
+<file path=customXml/itemProps1.xml><?xml version="1.0" encoding="utf-8"?>
+<ds:datastoreItem xmlns:ds="http://schemas.openxmlformats.org/officeDocument/2006/customXml" ds:itemID="{084C26D9-49C9-4ADB-A387-DA6079798921}">
+  <ds:schemaRefs>
+    <ds:schemaRef ds:uri="http://schemas.microsoft.com/sharepoint/v3/contenttype/forms"/>
+  </ds:schemaRefs>
+</ds:datastoreItem>
 </file>
 
-<file path=customXml/itemProps1.xml><?xml version="1.0" encoding="utf-8"?>
+<file path=customXml/itemProps2.xml><?xml version="1.0" encoding="utf-8"?>
 <ds:datastoreItem xmlns:ds="http://schemas.openxmlformats.org/officeDocument/2006/customXml" ds:itemID="{FACB83BB-458E-4CCB-91D7-35CFBA93934D}">
   <ds:schemaRefs>
     <ds:schemaRef ds:uri="http://schemas.openxmlformats.org/officeDocument/2006/bibliography"/>
@@ -19204,15 +19567,17 @@
 </ds:datastoreItem>
 </file>
 
-<file path=customXml/itemProps2.xml><?xml version="1.0" encoding="utf-8"?>
-<ds:datastoreItem xmlns:ds="http://schemas.openxmlformats.org/officeDocument/2006/customXml" ds:itemID="{084C26D9-49C9-4ADB-A387-DA6079798921}">
+<file path=customXml/itemProps3.xml><?xml version="1.0" encoding="utf-8"?>
+<ds:datastoreItem xmlns:ds="http://schemas.openxmlformats.org/officeDocument/2006/customXml" ds:itemID="{662F60C8-4BC5-4139-BE63-6954D22D77BD}">
   <ds:schemaRefs>
-    <ds:schemaRef ds:uri="http://schemas.microsoft.com/sharepoint/v3/contenttype/forms"/>
+    <ds:schemaRef ds:uri="http://schemas.microsoft.com/office/2006/metadata/properties"/>
+    <ds:schemaRef ds:uri="http://schemas.microsoft.com/office/infopath/2007/PartnerControls"/>
+    <ds:schemaRef ds:uri="0a2fff00-f002-44e7-b50c-b90cb65110b9"/>
   </ds:schemaRefs>
 </ds:datastoreItem>
 </file>
 
-<file path=customXml/itemProps3.xml><?xml version="1.0" encoding="utf-8"?>
+<file path=customXml/itemProps4.xml><?xml version="1.0" encoding="utf-8"?>
 <ds:datastoreItem xmlns:ds="http://schemas.openxmlformats.org/officeDocument/2006/customXml" ds:itemID="{CE4EBACF-5594-46F9-A2CF-C5555F399E1E}">
   <ds:schemaRefs>
     <ds:schemaRef ds:uri="http://schemas.microsoft.com/office/2006/metadata/contentType"/>
@@ -19228,14 +19593,4 @@
     <ds:schemaRef ds:uri="http://schemas.microsoft.com/internal/obd"/>
   </ds:schemaRefs>
 </ds:datastoreItem>
-</file>
-
-<file path=customXml/itemProps4.xml><?xml version="1.0" encoding="utf-8"?>
-<ds:datastoreItem xmlns:ds="http://schemas.openxmlformats.org/officeDocument/2006/customXml" ds:itemID="{662F60C8-4BC5-4139-BE63-6954D22D77BD}">
-  <ds:schemaRefs>
-    <ds:schemaRef ds:uri="http://schemas.microsoft.com/office/2006/metadata/properties"/>
-    <ds:schemaRef ds:uri="http://schemas.microsoft.com/office/infopath/2007/PartnerControls"/>
-    <ds:schemaRef ds:uri="0a2fff00-f002-44e7-b50c-b90cb65110b9"/>
-  </ds:schemaRefs>
-</ds:datastoreItem>
 </file>
</xml_diff>

<commit_message>
actualizacion documento con mapa cocneptual
</commit_message>
<xml_diff>
--- a/docs/informe_f1_f2_grupo_5.docx
+++ b/docs/informe_f1_f2_grupo_5.docx
@@ -12650,6 +12650,7 @@
       <w:r>
         <w:rPr>
           <w:rFonts w:ascii="Arial" w:hAnsi="Arial"/>
+          <w:noProof/>
           <w:sz w:val="24"/>
           <w:szCs w:val="24"/>
         </w:rPr>
@@ -12701,6 +12702,7 @@
       <w:r>
         <w:rPr>
           <w:rFonts w:ascii="Arial" w:hAnsi="Arial"/>
+          <w:noProof/>
           <w:sz w:val="24"/>
           <w:szCs w:val="24"/>
         </w:rPr>
@@ -12753,6 +12755,7 @@
       <w:r>
         <w:rPr>
           <w:rFonts w:ascii="Arial" w:hAnsi="Arial"/>
+          <w:noProof/>
           <w:sz w:val="24"/>
           <w:szCs w:val="24"/>
         </w:rPr>
@@ -12804,6 +12807,7 @@
       <w:r>
         <w:rPr>
           <w:rFonts w:ascii="Arial" w:hAnsi="Arial"/>
+          <w:noProof/>
           <w:sz w:val="24"/>
           <w:szCs w:val="24"/>
         </w:rPr>
@@ -12855,6 +12859,7 @@
       <w:r>
         <w:rPr>
           <w:rFonts w:ascii="Arial" w:hAnsi="Arial"/>
+          <w:noProof/>
           <w:sz w:val="24"/>
           <w:szCs w:val="24"/>
         </w:rPr>
@@ -12907,6 +12912,7 @@
       <w:r>
         <w:rPr>
           <w:rFonts w:ascii="Arial" w:hAnsi="Arial"/>
+          <w:noProof/>
           <w:sz w:val="24"/>
           <w:szCs w:val="24"/>
         </w:rPr>
@@ -12958,6 +12964,7 @@
       <w:r>
         <w:rPr>
           <w:rFonts w:ascii="Arial" w:hAnsi="Arial"/>
+          <w:noProof/>
           <w:sz w:val="24"/>
           <w:szCs w:val="24"/>
         </w:rPr>
@@ -13146,27 +13153,27 @@
           <w:sz w:val="24"/>
           <w:szCs w:val="24"/>
         </w:rPr>
-        <w:t xml:space="preserve">El mapa conceptual técnico elaborado en </w:t>
-      </w:r>
-      <w:proofErr w:type="spellStart"/>
-      <w:r>
-        <w:rPr>
-          <w:rFonts w:ascii="Arial" w:hAnsi="Arial"/>
-          <w:color w:val="auto"/>
-          <w:sz w:val="24"/>
-          <w:szCs w:val="24"/>
-        </w:rPr>
-        <w:t>docs</w:t>
-      </w:r>
-      <w:proofErr w:type="spellEnd"/>
-      <w:r>
-        <w:rPr>
-          <w:rFonts w:ascii="Arial" w:hAnsi="Arial"/>
-          <w:color w:val="auto"/>
-          <w:sz w:val="24"/>
-          <w:szCs w:val="24"/>
-        </w:rPr>
-        <w:t>/mapa_conceptual_f1_f2.drawio representa la arquitectura sistémica del proyecto. Refleja cómo la planificación conceptual se tradujo en artefactos técnicos concretos para F1 y F2, proyectando el trabajo restante hacia F3 y F4:</w:t>
+        <w:t xml:space="preserve">El mapa conceptual se utilizó como guía para organizar el inicio del proyecto. A partir del problema y del conjunto de datos se definieron tres componentes principales: el entorno reproducible, el uso de </w:t>
+      </w:r>
+      <w:proofErr w:type="spellStart"/>
+      <w:r>
+        <w:rPr>
+          <w:rFonts w:ascii="Arial" w:hAnsi="Arial"/>
+          <w:color w:val="auto"/>
+          <w:sz w:val="24"/>
+          <w:szCs w:val="24"/>
+        </w:rPr>
+        <w:t>Jupyter</w:t>
+      </w:r>
+      <w:proofErr w:type="spellEnd"/>
+      <w:r>
+        <w:rPr>
+          <w:rFonts w:ascii="Arial" w:hAnsi="Arial"/>
+          <w:color w:val="auto"/>
+          <w:sz w:val="24"/>
+          <w:szCs w:val="24"/>
+        </w:rPr>
+        <w:t xml:space="preserve"> Notebook y el trabajo colaborativo mediante Git y GitHub. Estos componentes orientaron la estructura del repositorio, la documentación del proceso y la coordinación de los cambios realizados por el equipo. En esta entrega se implementaron las actividades correspondientes a F1 y F2, mientras que el análisis, las visualizaciones y las conclusiones generales continuarán en F3 y F4.</w:t>
       </w:r>
     </w:p>
     <w:p>
@@ -13174,25 +13181,74 @@
         <w:jc w:val="both"/>
         <w:rPr>
           <w:rFonts w:ascii="Arial" w:hAnsi="Arial"/>
-          <w:color w:val="auto"/>
-          <w:sz w:val="24"/>
-          <w:szCs w:val="24"/>
-        </w:rPr>
-      </w:pPr>
-      <w:r>
-        <w:rPr>
-          <w:rFonts w:ascii="Arial" w:hAnsi="Arial"/>
-          <w:noProof/>
-          <w:color w:val="auto"/>
-          <w:sz w:val="24"/>
-          <w:szCs w:val="24"/>
+          <w:b/>
+          <w:bCs/>
+          <w:color w:val="auto"/>
+          <w:sz w:val="24"/>
+          <w:szCs w:val="24"/>
+        </w:rPr>
+      </w:pPr>
+      <w:r>
+        <w:rPr>
+          <w:rFonts w:ascii="Arial" w:hAnsi="Arial"/>
+          <w:b/>
+          <w:bCs/>
+          <w:color w:val="auto"/>
+          <w:sz w:val="24"/>
+          <w:szCs w:val="24"/>
+        </w:rPr>
+        <w:t>Figura 1</w:t>
+      </w:r>
+    </w:p>
+    <w:p>
+      <w:pPr>
+        <w:jc w:val="both"/>
+        <w:rPr>
+          <w:rFonts w:ascii="Arial" w:hAnsi="Arial"/>
+          <w:i/>
+          <w:iCs/>
+          <w:color w:val="auto"/>
+          <w:sz w:val="24"/>
+          <w:szCs w:val="24"/>
+        </w:rPr>
+      </w:pPr>
+      <w:r>
+        <w:rPr>
+          <w:rFonts w:ascii="Arial" w:hAnsi="Arial"/>
+          <w:i/>
+          <w:iCs/>
+          <w:color w:val="auto"/>
+          <w:sz w:val="24"/>
+          <w:szCs w:val="24"/>
+        </w:rPr>
+        <w:t>Mapa conceptual del flujo reproducible inicial del proyecto</w:t>
+      </w:r>
+    </w:p>
+    <w:p>
+      <w:pPr>
+        <w:jc w:val="both"/>
+        <w:rPr>
+          <w:rFonts w:ascii="Arial" w:hAnsi="Arial"/>
+          <w:color w:val="auto"/>
+          <w:sz w:val="24"/>
+          <w:szCs w:val="24"/>
+          <w:lang w:val="es-CL"/>
+        </w:rPr>
+      </w:pPr>
+      <w:r>
+        <w:rPr>
+          <w:rFonts w:ascii="Arial" w:hAnsi="Arial"/>
+          <w:color w:val="auto"/>
+          <w:sz w:val="24"/>
+          <w:szCs w:val="24"/>
+          <w:lang w:val="es-CL"/>
         </w:rPr>
         <w:lastRenderedPageBreak/>
         <w:drawing>
-          <wp:inline distT="0" distB="0" distL="0" distR="0" wp14:anchorId="45892221" wp14:editId="38EF35DD">
-            <wp:extent cx="6492240" cy="2813304"/>
+          <wp:inline distT="0" distB="0" distL="0" distR="0" wp14:anchorId="20B8AA07" wp14:editId="3A2D58F5">
+            <wp:extent cx="6309360" cy="4973320"/>
             <wp:effectExtent l="0" t="0" r="0" b="0"/>
-            <wp:docPr id="12" name="Picture 12"/>
+            <wp:docPr id="147322147" name="Imagen 10"/>
             <wp:cNvGraphicFramePr>
               <a:graphicFrameLocks xmlns:a="http://schemas.openxmlformats.org/drawingml/2006/main" noChangeAspect="1"/>
             </wp:cNvGraphicFramePr>
@@ -13200,23 +13256,36 @@
               <a:graphicData uri="http://schemas.openxmlformats.org/drawingml/2006/picture">
                 <pic:pic xmlns:pic="http://schemas.openxmlformats.org/drawingml/2006/picture">
                   <pic:nvPicPr>
-                    <pic:cNvPr id="0" name="mapa_sintesis.png"/>
-                    <pic:cNvPicPr/>
+                    <pic:cNvPr id="0" name="Picture 6"/>
+                    <pic:cNvPicPr>
+                      <a:picLocks noChangeAspect="1" noChangeArrowheads="1"/>
+                    </pic:cNvPicPr>
                   </pic:nvPicPr>
                   <pic:blipFill>
-                    <a:blip r:embed="rId32"/>
+                    <a:blip r:embed="rId32">
+                      <a:extLst>
+                        <a:ext uri="{28A0092B-C50C-407E-A947-70E740481C1C}">
+                          <a14:useLocalDpi xmlns:a14="http://schemas.microsoft.com/office/drawing/2010/main" val="0"/>
+                        </a:ext>
+                      </a:extLst>
+                    </a:blip>
+                    <a:srcRect/>
                     <a:stretch>
                       <a:fillRect/>
                     </a:stretch>
                   </pic:blipFill>
-                  <pic:spPr>
+                  <pic:spPr bwMode="auto">
                     <a:xfrm>
                       <a:off x="0" y="0"/>
-                      <a:ext cx="6492240" cy="2813304"/>
+                      <a:ext cx="6309360" cy="4973320"/>
                     </a:xfrm>
                     <a:prstGeom prst="rect">
                       <a:avLst/>
                     </a:prstGeom>
+                    <a:noFill/>
+                    <a:ln>
+                      <a:noFill/>
+                    </a:ln>
                   </pic:spPr>
                 </pic:pic>
               </a:graphicData>
@@ -13227,6 +13296,18 @@
     </w:p>
     <w:p>
       <w:pPr>
+        <w:jc w:val="both"/>
+        <w:rPr>
+          <w:rFonts w:ascii="Arial" w:hAnsi="Arial"/>
+          <w:color w:val="auto"/>
+          <w:sz w:val="24"/>
+          <w:szCs w:val="24"/>
+          <w:lang w:val="es-CL"/>
+        </w:rPr>
+      </w:pPr>
+    </w:p>
+    <w:p>
+      <w:pPr>
         <w:pStyle w:val="Descripcin1"/>
         <w:jc w:val="both"/>
         <w:rPr>
@@ -13236,6 +13317,166 @@
           <w:szCs w:val="24"/>
         </w:rPr>
       </w:pPr>
+      <w:r>
+        <w:rPr>
+          <w:rFonts w:ascii="Arial" w:hAnsi="Arial" w:cs="Arial"/>
+          <w:i/>
+          <w:iCs/>
+          <w:color w:val="auto"/>
+          <w:sz w:val="24"/>
+          <w:szCs w:val="24"/>
+        </w:rPr>
+        <w:t>Nota</w:t>
+      </w:r>
+      <w:r>
+        <w:rPr>
+          <w:rFonts w:ascii="Arial" w:hAnsi="Arial" w:cs="Arial"/>
+          <w:color w:val="auto"/>
+          <w:sz w:val="24"/>
+          <w:szCs w:val="24"/>
+        </w:rPr>
+        <w:t xml:space="preserve">. </w:t>
+      </w:r>
+      <w:proofErr w:type="spellStart"/>
+      <w:r>
+        <w:rPr>
+          <w:rFonts w:ascii="Arial" w:hAnsi="Arial" w:cs="Arial"/>
+          <w:color w:val="auto"/>
+          <w:sz w:val="24"/>
+          <w:szCs w:val="24"/>
+        </w:rPr>
+        <w:t>Elaboración</w:t>
+      </w:r>
+      <w:proofErr w:type="spellEnd"/>
+      <w:r>
+        <w:rPr>
+          <w:rFonts w:ascii="Arial" w:hAnsi="Arial" w:cs="Arial"/>
+          <w:color w:val="auto"/>
+          <w:sz w:val="24"/>
+          <w:szCs w:val="24"/>
+        </w:rPr>
+        <w:t xml:space="preserve"> </w:t>
+      </w:r>
+      <w:proofErr w:type="spellStart"/>
+      <w:r>
+        <w:rPr>
+          <w:rFonts w:ascii="Arial" w:hAnsi="Arial" w:cs="Arial"/>
+          <w:color w:val="auto"/>
+          <w:sz w:val="24"/>
+          <w:szCs w:val="24"/>
+        </w:rPr>
+        <w:t>propia</w:t>
+      </w:r>
+      <w:proofErr w:type="spellEnd"/>
+      <w:r>
+        <w:rPr>
+          <w:rFonts w:ascii="Arial" w:hAnsi="Arial" w:cs="Arial"/>
+          <w:color w:val="auto"/>
+          <w:sz w:val="24"/>
+          <w:szCs w:val="24"/>
+        </w:rPr>
+        <w:t xml:space="preserve">. La </w:t>
+      </w:r>
+      <w:proofErr w:type="spellStart"/>
+      <w:r>
+        <w:rPr>
+          <w:rFonts w:ascii="Arial" w:hAnsi="Arial" w:cs="Arial"/>
+          <w:color w:val="auto"/>
+          <w:sz w:val="24"/>
+          <w:szCs w:val="24"/>
+        </w:rPr>
+        <w:t>versión</w:t>
+      </w:r>
+      <w:proofErr w:type="spellEnd"/>
+      <w:r>
+        <w:rPr>
+          <w:rFonts w:ascii="Arial" w:hAnsi="Arial" w:cs="Arial"/>
+          <w:color w:val="auto"/>
+          <w:sz w:val="24"/>
+          <w:szCs w:val="24"/>
+        </w:rPr>
+        <w:t xml:space="preserve"> editable se </w:t>
+      </w:r>
+      <w:proofErr w:type="spellStart"/>
+      <w:r>
+        <w:rPr>
+          <w:rFonts w:ascii="Arial" w:hAnsi="Arial" w:cs="Arial"/>
+          <w:color w:val="auto"/>
+          <w:sz w:val="24"/>
+          <w:szCs w:val="24"/>
+        </w:rPr>
+        <w:t>encuentra</w:t>
+      </w:r>
+      <w:proofErr w:type="spellEnd"/>
+      <w:r>
+        <w:rPr>
+          <w:rFonts w:ascii="Arial" w:hAnsi="Arial" w:cs="Arial"/>
+          <w:color w:val="auto"/>
+          <w:sz w:val="24"/>
+          <w:szCs w:val="24"/>
+        </w:rPr>
+        <w:t xml:space="preserve"> </w:t>
+      </w:r>
+      <w:proofErr w:type="spellStart"/>
+      <w:r>
+        <w:rPr>
+          <w:rFonts w:ascii="Arial" w:hAnsi="Arial" w:cs="Arial"/>
+          <w:color w:val="auto"/>
+          <w:sz w:val="24"/>
+          <w:szCs w:val="24"/>
+        </w:rPr>
+        <w:t>en</w:t>
+      </w:r>
+      <w:proofErr w:type="spellEnd"/>
+      <w:r>
+        <w:rPr>
+          <w:rFonts w:ascii="Arial" w:hAnsi="Arial" w:cs="Arial"/>
+          <w:color w:val="auto"/>
+          <w:sz w:val="24"/>
+          <w:szCs w:val="24"/>
+        </w:rPr>
+        <w:t xml:space="preserve"> docs/mcdi500_s1_grupo5.drawio y la </w:t>
+      </w:r>
+      <w:proofErr w:type="spellStart"/>
+      <w:r>
+        <w:rPr>
+          <w:rFonts w:ascii="Arial" w:hAnsi="Arial" w:cs="Arial"/>
+          <w:color w:val="auto"/>
+          <w:sz w:val="24"/>
+          <w:szCs w:val="24"/>
+        </w:rPr>
+        <w:t>versión</w:t>
+      </w:r>
+      <w:proofErr w:type="spellEnd"/>
+      <w:r>
+        <w:rPr>
+          <w:rFonts w:ascii="Arial" w:hAnsi="Arial" w:cs="Arial"/>
+          <w:color w:val="auto"/>
+          <w:sz w:val="24"/>
+          <w:szCs w:val="24"/>
+        </w:rPr>
+        <w:t xml:space="preserve"> final </w:t>
+      </w:r>
+      <w:proofErr w:type="spellStart"/>
+      <w:r>
+        <w:rPr>
+          <w:rFonts w:ascii="Arial" w:hAnsi="Arial" w:cs="Arial"/>
+          <w:color w:val="auto"/>
+          <w:sz w:val="24"/>
+          <w:szCs w:val="24"/>
+        </w:rPr>
+        <w:t>en</w:t>
+      </w:r>
+      <w:proofErr w:type="spellEnd"/>
+      <w:r>
+        <w:rPr>
+          <w:rFonts w:ascii="Arial" w:hAnsi="Arial" w:cs="Arial"/>
+          <w:color w:val="auto"/>
+          <w:sz w:val="24"/>
+          <w:szCs w:val="24"/>
+        </w:rPr>
+        <w:t xml:space="preserve"> docs/mcdi500_s1_grupo5.pdf.</w:t>
+      </w:r>
     </w:p>
     <w:p>
       <w:pPr>
@@ -13243,210 +13484,36 @@
         <w:jc w:val="both"/>
         <w:rPr>
           <w:rFonts w:ascii="Arial" w:hAnsi="Arial" w:cs="Arial"/>
-          <w:color w:val="auto"/>
-          <w:sz w:val="24"/>
-          <w:szCs w:val="24"/>
-        </w:rPr>
-      </w:pPr>
-      <w:proofErr w:type="spellStart"/>
-      <w:r>
-        <w:rPr>
-          <w:rFonts w:ascii="Arial" w:hAnsi="Arial" w:cs="Arial"/>
-          <w:color w:val="auto"/>
-          <w:sz w:val="24"/>
-          <w:szCs w:val="24"/>
-        </w:rPr>
-        <w:t>Figura</w:t>
-      </w:r>
-      <w:proofErr w:type="spellEnd"/>
-      <w:r>
-        <w:rPr>
-          <w:rFonts w:ascii="Arial" w:hAnsi="Arial" w:cs="Arial"/>
-          <w:color w:val="auto"/>
-          <w:sz w:val="24"/>
-          <w:szCs w:val="24"/>
-        </w:rPr>
-        <w:t xml:space="preserve"> 1. </w:t>
-      </w:r>
-      <w:proofErr w:type="spellStart"/>
-      <w:r>
-        <w:rPr>
-          <w:rFonts w:ascii="Arial" w:hAnsi="Arial" w:cs="Arial"/>
-          <w:color w:val="auto"/>
-          <w:sz w:val="24"/>
-          <w:szCs w:val="24"/>
-        </w:rPr>
-        <w:t>Síntesis</w:t>
-      </w:r>
-      <w:proofErr w:type="spellEnd"/>
-      <w:r>
-        <w:rPr>
-          <w:rFonts w:ascii="Arial" w:hAnsi="Arial" w:cs="Arial"/>
-          <w:color w:val="auto"/>
-          <w:sz w:val="24"/>
-          <w:szCs w:val="24"/>
-        </w:rPr>
-        <w:t xml:space="preserve"> </w:t>
-      </w:r>
-      <w:proofErr w:type="spellStart"/>
-      <w:r>
-        <w:rPr>
-          <w:rFonts w:ascii="Arial" w:hAnsi="Arial" w:cs="Arial"/>
-          <w:color w:val="auto"/>
-          <w:sz w:val="24"/>
-          <w:szCs w:val="24"/>
-        </w:rPr>
-        <w:t>gráfica</w:t>
-      </w:r>
-      <w:proofErr w:type="spellEnd"/>
-      <w:r>
-        <w:rPr>
-          <w:rFonts w:ascii="Arial" w:hAnsi="Arial" w:cs="Arial"/>
-          <w:color w:val="auto"/>
-          <w:sz w:val="24"/>
-          <w:szCs w:val="24"/>
-        </w:rPr>
-        <w:t xml:space="preserve"> del </w:t>
-      </w:r>
-      <w:proofErr w:type="spellStart"/>
-      <w:r>
-        <w:rPr>
-          <w:rFonts w:ascii="Arial" w:hAnsi="Arial" w:cs="Arial"/>
-          <w:color w:val="auto"/>
-          <w:sz w:val="24"/>
-          <w:szCs w:val="24"/>
-        </w:rPr>
-        <w:t>mapa</w:t>
-      </w:r>
-      <w:proofErr w:type="spellEnd"/>
-      <w:r>
-        <w:rPr>
-          <w:rFonts w:ascii="Arial" w:hAnsi="Arial" w:cs="Arial"/>
-          <w:color w:val="auto"/>
-          <w:sz w:val="24"/>
-          <w:szCs w:val="24"/>
-        </w:rPr>
-        <w:t xml:space="preserve"> conceptual </w:t>
-      </w:r>
-      <w:proofErr w:type="spellStart"/>
-      <w:r>
-        <w:rPr>
-          <w:rFonts w:ascii="Arial" w:hAnsi="Arial" w:cs="Arial"/>
-          <w:color w:val="auto"/>
-          <w:sz w:val="24"/>
-          <w:szCs w:val="24"/>
-        </w:rPr>
-        <w:t>técnico</w:t>
-      </w:r>
-      <w:proofErr w:type="spellEnd"/>
-      <w:r>
-        <w:rPr>
-          <w:rFonts w:ascii="Arial" w:hAnsi="Arial" w:cs="Arial"/>
-          <w:color w:val="auto"/>
-          <w:sz w:val="24"/>
-          <w:szCs w:val="24"/>
-        </w:rPr>
-        <w:t xml:space="preserve"> del </w:t>
-      </w:r>
-      <w:proofErr w:type="spellStart"/>
-      <w:r>
-        <w:rPr>
-          <w:rFonts w:ascii="Arial" w:hAnsi="Arial" w:cs="Arial"/>
-          <w:color w:val="auto"/>
-          <w:sz w:val="24"/>
-          <w:szCs w:val="24"/>
-        </w:rPr>
-        <w:t>proyecto</w:t>
-      </w:r>
-      <w:proofErr w:type="spellEnd"/>
-      <w:r>
-        <w:rPr>
-          <w:rFonts w:ascii="Arial" w:hAnsi="Arial" w:cs="Arial"/>
-          <w:color w:val="auto"/>
-          <w:sz w:val="24"/>
-          <w:szCs w:val="24"/>
-        </w:rPr>
-        <w:t xml:space="preserve"> transversal. El </w:t>
-      </w:r>
-      <w:proofErr w:type="spellStart"/>
-      <w:r>
-        <w:rPr>
-          <w:rFonts w:ascii="Arial" w:hAnsi="Arial" w:cs="Arial"/>
-          <w:color w:val="auto"/>
-          <w:sz w:val="24"/>
-          <w:szCs w:val="24"/>
-        </w:rPr>
-        <w:t>archivo</w:t>
-      </w:r>
-      <w:proofErr w:type="spellEnd"/>
-      <w:r>
-        <w:rPr>
-          <w:rFonts w:ascii="Arial" w:hAnsi="Arial" w:cs="Arial"/>
-          <w:color w:val="auto"/>
-          <w:sz w:val="24"/>
-          <w:szCs w:val="24"/>
-        </w:rPr>
-        <w:t xml:space="preserve"> editable </w:t>
-      </w:r>
-      <w:proofErr w:type="spellStart"/>
-      <w:r>
-        <w:rPr>
-          <w:rFonts w:ascii="Arial" w:hAnsi="Arial" w:cs="Arial"/>
-          <w:color w:val="auto"/>
-          <w:sz w:val="24"/>
-          <w:szCs w:val="24"/>
-        </w:rPr>
-        <w:t>completo</w:t>
-      </w:r>
-      <w:proofErr w:type="spellEnd"/>
-      <w:r>
-        <w:rPr>
-          <w:rFonts w:ascii="Arial" w:hAnsi="Arial" w:cs="Arial"/>
-          <w:color w:val="auto"/>
-          <w:sz w:val="24"/>
-          <w:szCs w:val="24"/>
-        </w:rPr>
-        <w:t xml:space="preserve"> se </w:t>
-      </w:r>
-      <w:proofErr w:type="spellStart"/>
-      <w:r>
-        <w:rPr>
-          <w:rFonts w:ascii="Arial" w:hAnsi="Arial" w:cs="Arial"/>
-          <w:color w:val="auto"/>
-          <w:sz w:val="24"/>
-          <w:szCs w:val="24"/>
-        </w:rPr>
-        <w:t>encuentra</w:t>
-      </w:r>
-      <w:proofErr w:type="spellEnd"/>
-      <w:r>
-        <w:rPr>
-          <w:rFonts w:ascii="Arial" w:hAnsi="Arial" w:cs="Arial"/>
-          <w:color w:val="auto"/>
-          <w:sz w:val="24"/>
-          <w:szCs w:val="24"/>
-        </w:rPr>
-        <w:t xml:space="preserve"> disponible </w:t>
-      </w:r>
-      <w:proofErr w:type="spellStart"/>
-      <w:r>
-        <w:rPr>
-          <w:rFonts w:ascii="Arial" w:hAnsi="Arial" w:cs="Arial"/>
-          <w:color w:val="auto"/>
-          <w:sz w:val="24"/>
-          <w:szCs w:val="24"/>
-        </w:rPr>
-        <w:t>en</w:t>
-      </w:r>
-      <w:proofErr w:type="spellEnd"/>
-      <w:r>
-        <w:rPr>
-          <w:rFonts w:ascii="Arial" w:hAnsi="Arial" w:cs="Arial"/>
-          <w:color w:val="auto"/>
-          <w:sz w:val="24"/>
-          <w:szCs w:val="24"/>
-        </w:rPr>
-        <w:t xml:space="preserve"> docs/mapa_conceptual_f1_f2.drawio.</w:t>
+          <w:b/>
+          <w:bCs/>
+          <w:color w:val="auto"/>
+          <w:sz w:val="24"/>
+          <w:szCs w:val="24"/>
+        </w:rPr>
+      </w:pPr>
+      <w:proofErr w:type="spellStart"/>
+      <w:r>
+        <w:rPr>
+          <w:rFonts w:ascii="Arial" w:hAnsi="Arial" w:cs="Arial"/>
+          <w:b/>
+          <w:bCs/>
+          <w:color w:val="auto"/>
+          <w:sz w:val="24"/>
+          <w:szCs w:val="24"/>
+        </w:rPr>
+        <w:t>Tabla</w:t>
+      </w:r>
+      <w:proofErr w:type="spellEnd"/>
+      <w:r>
+        <w:rPr>
+          <w:rFonts w:ascii="Arial" w:hAnsi="Arial" w:cs="Arial"/>
+          <w:b/>
+          <w:bCs/>
+          <w:color w:val="auto"/>
+          <w:sz w:val="24"/>
+          <w:szCs w:val="24"/>
+        </w:rPr>
+        <w:t xml:space="preserve"> 6</w:t>
       </w:r>
     </w:p>
     <w:p>
@@ -13460,165 +13527,247 @@
           <w:szCs w:val="24"/>
         </w:rPr>
       </w:pPr>
+      <w:proofErr w:type="spellStart"/>
+      <w:r>
+        <w:rPr>
+          <w:rFonts w:ascii="Arial" w:hAnsi="Arial" w:cs="Arial"/>
+          <w:color w:val="auto"/>
+          <w:sz w:val="24"/>
+          <w:szCs w:val="24"/>
+        </w:rPr>
+        <w:t>Correspondencia</w:t>
+      </w:r>
+      <w:proofErr w:type="spellEnd"/>
+      <w:r>
+        <w:rPr>
+          <w:rFonts w:ascii="Arial" w:hAnsi="Arial" w:cs="Arial"/>
+          <w:color w:val="auto"/>
+          <w:sz w:val="24"/>
+          <w:szCs w:val="24"/>
+        </w:rPr>
+        <w:t xml:space="preserve"> entre el </w:t>
+      </w:r>
+      <w:proofErr w:type="spellStart"/>
+      <w:r>
+        <w:rPr>
+          <w:rFonts w:ascii="Arial" w:hAnsi="Arial" w:cs="Arial"/>
+          <w:color w:val="auto"/>
+          <w:sz w:val="24"/>
+          <w:szCs w:val="24"/>
+        </w:rPr>
+        <w:t>mapa</w:t>
+      </w:r>
+      <w:proofErr w:type="spellEnd"/>
+      <w:r>
+        <w:rPr>
+          <w:rFonts w:ascii="Arial" w:hAnsi="Arial" w:cs="Arial"/>
+          <w:color w:val="auto"/>
+          <w:sz w:val="24"/>
+          <w:szCs w:val="24"/>
+        </w:rPr>
+        <w:t xml:space="preserve"> conceptual y </w:t>
+      </w:r>
+      <w:proofErr w:type="spellStart"/>
+      <w:r>
+        <w:rPr>
+          <w:rFonts w:ascii="Arial" w:hAnsi="Arial" w:cs="Arial"/>
+          <w:color w:val="auto"/>
+          <w:sz w:val="24"/>
+          <w:szCs w:val="24"/>
+        </w:rPr>
+        <w:t>los</w:t>
+      </w:r>
+      <w:proofErr w:type="spellEnd"/>
+      <w:r>
+        <w:rPr>
+          <w:rFonts w:ascii="Arial" w:hAnsi="Arial" w:cs="Arial"/>
+          <w:color w:val="auto"/>
+          <w:sz w:val="24"/>
+          <w:szCs w:val="24"/>
+        </w:rPr>
+        <w:t xml:space="preserve"> </w:t>
+      </w:r>
+      <w:proofErr w:type="spellStart"/>
+      <w:r>
+        <w:rPr>
+          <w:rFonts w:ascii="Arial" w:hAnsi="Arial" w:cs="Arial"/>
+          <w:color w:val="auto"/>
+          <w:sz w:val="24"/>
+          <w:szCs w:val="24"/>
+        </w:rPr>
+        <w:t>productos</w:t>
+      </w:r>
+      <w:proofErr w:type="spellEnd"/>
+      <w:r>
+        <w:rPr>
+          <w:rFonts w:ascii="Arial" w:hAnsi="Arial" w:cs="Arial"/>
+          <w:color w:val="auto"/>
+          <w:sz w:val="24"/>
+          <w:szCs w:val="24"/>
+        </w:rPr>
+        <w:t xml:space="preserve"> </w:t>
+      </w:r>
+      <w:proofErr w:type="spellStart"/>
+      <w:r>
+        <w:rPr>
+          <w:rFonts w:ascii="Arial" w:hAnsi="Arial" w:cs="Arial"/>
+          <w:color w:val="auto"/>
+          <w:sz w:val="24"/>
+          <w:szCs w:val="24"/>
+        </w:rPr>
+        <w:t>desarrollados</w:t>
+      </w:r>
+      <w:proofErr w:type="spellEnd"/>
     </w:p>
     <w:tbl>
       <w:tblPr>
         <w:tblW w:w="0" w:type="auto"/>
-        <w:jc w:val="center"/>
+        <w:tblCellSpacing w:w="15" w:type="dxa"/>
         <w:tblBorders>
-          <w:top w:val="single" w:sz="4" w:space="0" w:color="D1D5DB"/>
-          <w:left w:val="single" w:sz="4" w:space="0" w:color="D1D5DB"/>
-          <w:bottom w:val="single" w:sz="4" w:space="0" w:color="D1D5DB"/>
-          <w:right w:val="single" w:sz="4" w:space="0" w:color="D1D5DB"/>
-          <w:insideH w:val="single" w:sz="4" w:space="0" w:color="D1D5DB"/>
-          <w:insideV w:val="single" w:sz="4" w:space="0" w:color="D1D5DB"/>
+          <w:top w:val="single" w:sz="4" w:space="0" w:color="auto"/>
+          <w:left w:val="single" w:sz="4" w:space="0" w:color="auto"/>
+          <w:bottom w:val="single" w:sz="4" w:space="0" w:color="auto"/>
+          <w:right w:val="single" w:sz="4" w:space="0" w:color="auto"/>
+          <w:insideH w:val="single" w:sz="4" w:space="0" w:color="auto"/>
+          <w:insideV w:val="single" w:sz="4" w:space="0" w:color="auto"/>
         </w:tblBorders>
-        <w:tblLayout w:type="fixed"/>
+        <w:tblCellMar>
+          <w:top w:w="15" w:type="dxa"/>
+          <w:left w:w="15" w:type="dxa"/>
+          <w:bottom w:w="15" w:type="dxa"/>
+          <w:right w:w="15" w:type="dxa"/>
+        </w:tblCellMar>
         <w:tblLook w:val="04A0" w:firstRow="1" w:lastRow="0" w:firstColumn="1" w:lastColumn="0" w:noHBand="0" w:noVBand="1"/>
       </w:tblPr>
       <w:tblGrid>
-        <w:gridCol w:w="3168"/>
-        <w:gridCol w:w="2160"/>
-        <w:gridCol w:w="4752"/>
+        <w:gridCol w:w="2360"/>
+        <w:gridCol w:w="4205"/>
+        <w:gridCol w:w="3361"/>
       </w:tblGrid>
       <w:tr>
         <w:trPr>
-          <w:cantSplit/>
           <w:tblHeader/>
-          <w:jc w:val="center"/>
+          <w:tblCellSpacing w:w="15" w:type="dxa"/>
         </w:trPr>
         <w:tc>
           <w:tcPr>
-            <w:tcW w:w="3168" w:type="dxa"/>
-            <w:shd w:val="clear" w:color="auto" w:fill="E7EEF4"/>
-            <w:tcMar>
-              <w:top w:w="90" w:type="dxa"/>
-              <w:left w:w="90" w:type="dxa"/>
-              <w:bottom w:w="90" w:type="dxa"/>
-              <w:right w:w="90" w:type="dxa"/>
-            </w:tcMar>
+            <w:tcW w:w="0" w:type="auto"/>
             <w:vAlign w:val="center"/>
+            <w:hideMark/>
           </w:tcPr>
           <w:p>
             <w:pPr>
-              <w:spacing w:after="40"/>
               <w:jc w:val="both"/>
               <w:rPr>
                 <w:rFonts w:ascii="Arial" w:hAnsi="Arial"/>
-                <w:color w:val="auto"/>
-                <w:sz w:val="24"/>
-                <w:szCs w:val="24"/>
+                <w:b/>
+                <w:bCs/>
+                <w:color w:val="auto"/>
+                <w:sz w:val="24"/>
+                <w:szCs w:val="24"/>
+                <w:lang w:val="es-CL"/>
               </w:rPr>
             </w:pPr>
             <w:r>
               <w:rPr>
                 <w:rFonts w:ascii="Arial" w:hAnsi="Arial"/>
                 <w:b/>
-                <w:color w:val="auto"/>
-                <w:sz w:val="24"/>
-                <w:szCs w:val="24"/>
-              </w:rPr>
-              <w:t>Componente del Mapa Conceptual</w:t>
+                <w:bCs/>
+                <w:color w:val="auto"/>
+                <w:sz w:val="24"/>
+                <w:szCs w:val="24"/>
+                <w:lang w:val="es-CL"/>
+              </w:rPr>
+              <w:t>Componente del mapa</w:t>
             </w:r>
           </w:p>
         </w:tc>
         <w:tc>
           <w:tcPr>
-            <w:tcW w:w="2160" w:type="dxa"/>
-            <w:shd w:val="clear" w:color="auto" w:fill="E7EEF4"/>
-            <w:tcMar>
-              <w:top w:w="90" w:type="dxa"/>
-              <w:left w:w="90" w:type="dxa"/>
-              <w:bottom w:w="90" w:type="dxa"/>
-              <w:right w:w="90" w:type="dxa"/>
-            </w:tcMar>
+            <w:tcW w:w="0" w:type="auto"/>
             <w:vAlign w:val="center"/>
+            <w:hideMark/>
           </w:tcPr>
           <w:p>
             <w:pPr>
-              <w:spacing w:after="40"/>
               <w:jc w:val="both"/>
               <w:rPr>
                 <w:rFonts w:ascii="Arial" w:hAnsi="Arial"/>
-                <w:color w:val="auto"/>
-                <w:sz w:val="24"/>
-                <w:szCs w:val="24"/>
+                <w:b/>
+                <w:bCs/>
+                <w:color w:val="auto"/>
+                <w:sz w:val="24"/>
+                <w:szCs w:val="24"/>
+                <w:lang w:val="es-CL"/>
               </w:rPr>
             </w:pPr>
             <w:r>
               <w:rPr>
                 <w:rFonts w:ascii="Arial" w:hAnsi="Arial"/>
                 <w:b/>
-                <w:color w:val="auto"/>
-                <w:sz w:val="24"/>
-                <w:szCs w:val="24"/>
-              </w:rPr>
-              <w:t>Estado en el Proyecto</w:t>
+                <w:bCs/>
+                <w:color w:val="auto"/>
+                <w:sz w:val="24"/>
+                <w:szCs w:val="24"/>
+                <w:lang w:val="es-CL"/>
+              </w:rPr>
+              <w:t>Aplicación en el proyecto</w:t>
             </w:r>
           </w:p>
         </w:tc>
         <w:tc>
           <w:tcPr>
-            <w:tcW w:w="4752" w:type="dxa"/>
-            <w:shd w:val="clear" w:color="auto" w:fill="E7EEF4"/>
-            <w:tcMar>
-              <w:top w:w="90" w:type="dxa"/>
-              <w:left w:w="90" w:type="dxa"/>
-              <w:bottom w:w="90" w:type="dxa"/>
-              <w:right w:w="90" w:type="dxa"/>
-            </w:tcMar>
+            <w:tcW w:w="0" w:type="auto"/>
             <w:vAlign w:val="center"/>
+            <w:hideMark/>
           </w:tcPr>
           <w:p>
             <w:pPr>
-              <w:spacing w:after="40"/>
               <w:jc w:val="both"/>
               <w:rPr>
                 <w:rFonts w:ascii="Arial" w:hAnsi="Arial"/>
-                <w:color w:val="auto"/>
-                <w:sz w:val="24"/>
-                <w:szCs w:val="24"/>
+                <w:b/>
+                <w:bCs/>
+                <w:color w:val="auto"/>
+                <w:sz w:val="24"/>
+                <w:szCs w:val="24"/>
+                <w:lang w:val="es-CL"/>
               </w:rPr>
             </w:pPr>
             <w:r>
               <w:rPr>
                 <w:rFonts w:ascii="Arial" w:hAnsi="Arial"/>
                 <w:b/>
-                <w:color w:val="auto"/>
-                <w:sz w:val="24"/>
-                <w:szCs w:val="24"/>
-              </w:rPr>
-              <w:t>Artefacto / Archivo de Respaldo en Repositorio</w:t>
+                <w:bCs/>
+                <w:color w:val="auto"/>
+                <w:sz w:val="24"/>
+                <w:szCs w:val="24"/>
+                <w:lang w:val="es-CL"/>
+              </w:rPr>
+              <w:t>Evidencia</w:t>
             </w:r>
           </w:p>
         </w:tc>
       </w:tr>
       <w:tr>
         <w:trPr>
-          <w:cantSplit/>
-          <w:jc w:val="center"/>
+          <w:tblCellSpacing w:w="15" w:type="dxa"/>
         </w:trPr>
         <w:tc>
           <w:tcPr>
-            <w:tcW w:w="3168" w:type="dxa"/>
-            <w:shd w:val="clear" w:color="auto" w:fill="F9FAFB"/>
-            <w:tcMar>
-              <w:top w:w="90" w:type="dxa"/>
-              <w:left w:w="90" w:type="dxa"/>
-              <w:bottom w:w="90" w:type="dxa"/>
-              <w:right w:w="90" w:type="dxa"/>
-            </w:tcMar>
+            <w:tcW w:w="0" w:type="auto"/>
             <w:vAlign w:val="center"/>
+            <w:hideMark/>
           </w:tcPr>
           <w:p>
             <w:pPr>
-              <w:spacing w:after="40"/>
               <w:jc w:val="both"/>
               <w:rPr>
                 <w:rFonts w:ascii="Arial" w:hAnsi="Arial"/>
                 <w:color w:val="auto"/>
                 <w:sz w:val="24"/>
                 <w:szCs w:val="24"/>
+                <w:lang w:val="es-CL"/>
               </w:rPr>
             </w:pPr>
             <w:r>
@@ -13627,32 +13776,27 @@
                 <w:color w:val="auto"/>
                 <w:sz w:val="24"/>
                 <w:szCs w:val="24"/>
-              </w:rPr>
-              <w:t>Problema, unidad de análisis y objetivos</w:t>
+                <w:lang w:val="es-CL"/>
+              </w:rPr>
+              <w:t>Problema y datos</w:t>
             </w:r>
           </w:p>
         </w:tc>
         <w:tc>
           <w:tcPr>
-            <w:tcW w:w="2160" w:type="dxa"/>
-            <w:shd w:val="clear" w:color="auto" w:fill="F9FAFB"/>
-            <w:tcMar>
-              <w:top w:w="90" w:type="dxa"/>
-              <w:left w:w="90" w:type="dxa"/>
-              <w:bottom w:w="90" w:type="dxa"/>
-              <w:right w:w="90" w:type="dxa"/>
-            </w:tcMar>
+            <w:tcW w:w="0" w:type="auto"/>
             <w:vAlign w:val="center"/>
+            <w:hideMark/>
           </w:tcPr>
           <w:p>
             <w:pPr>
-              <w:spacing w:after="40"/>
               <w:jc w:val="both"/>
               <w:rPr>
                 <w:rFonts w:ascii="Arial" w:hAnsi="Arial"/>
                 <w:color w:val="auto"/>
                 <w:sz w:val="24"/>
                 <w:szCs w:val="24"/>
+                <w:lang w:val="es-CL"/>
               </w:rPr>
             </w:pPr>
             <w:r>
@@ -13661,32 +13805,27 @@
                 <w:color w:val="auto"/>
                 <w:sz w:val="24"/>
                 <w:szCs w:val="24"/>
-              </w:rPr>
-              <w:t>Implementado (F1)</w:t>
+                <w:lang w:val="es-CL"/>
+              </w:rPr>
+              <w:t>Se definió la pregunta de análisis, la unidad de trabajo y el alcance descriptivo</w:t>
             </w:r>
           </w:p>
         </w:tc>
         <w:tc>
           <w:tcPr>
-            <w:tcW w:w="4752" w:type="dxa"/>
-            <w:shd w:val="clear" w:color="auto" w:fill="F9FAFB"/>
-            <w:tcMar>
-              <w:top w:w="90" w:type="dxa"/>
-              <w:left w:w="90" w:type="dxa"/>
-              <w:bottom w:w="90" w:type="dxa"/>
-              <w:right w:w="90" w:type="dxa"/>
-            </w:tcMar>
+            <w:tcW w:w="0" w:type="auto"/>
             <w:vAlign w:val="center"/>
+            <w:hideMark/>
           </w:tcPr>
           <w:p>
             <w:pPr>
-              <w:spacing w:after="40"/>
               <w:jc w:val="both"/>
               <w:rPr>
                 <w:rFonts w:ascii="Arial" w:hAnsi="Arial"/>
                 <w:color w:val="auto"/>
                 <w:sz w:val="24"/>
                 <w:szCs w:val="24"/>
+                <w:lang w:val="es-CL"/>
               </w:rPr>
             </w:pPr>
             <w:r>
@@ -13695,38 +13834,32 @@
                 <w:color w:val="auto"/>
                 <w:sz w:val="24"/>
                 <w:szCs w:val="24"/>
-              </w:rPr>
-              <w:t>F1/F1_Definición.ipynb (secciones 1–4) y data/README.md</w:t>
+                <w:lang w:val="es-CL"/>
+              </w:rPr>
+              <w:t>F1/F1_Definición.ipynb y data/README.md</w:t>
             </w:r>
           </w:p>
         </w:tc>
       </w:tr>
       <w:tr>
         <w:trPr>
-          <w:cantSplit/>
-          <w:jc w:val="center"/>
+          <w:tblCellSpacing w:w="15" w:type="dxa"/>
         </w:trPr>
         <w:tc>
           <w:tcPr>
-            <w:tcW w:w="3168" w:type="dxa"/>
-            <w:shd w:val="clear" w:color="auto" w:fill="FFFFFF"/>
-            <w:tcMar>
-              <w:top w:w="90" w:type="dxa"/>
-              <w:left w:w="90" w:type="dxa"/>
-              <w:bottom w:w="90" w:type="dxa"/>
-              <w:right w:w="90" w:type="dxa"/>
-            </w:tcMar>
+            <w:tcW w:w="0" w:type="auto"/>
             <w:vAlign w:val="center"/>
+            <w:hideMark/>
           </w:tcPr>
           <w:p>
             <w:pPr>
-              <w:spacing w:after="40"/>
               <w:jc w:val="both"/>
               <w:rPr>
                 <w:rFonts w:ascii="Arial" w:hAnsi="Arial"/>
                 <w:color w:val="auto"/>
                 <w:sz w:val="24"/>
                 <w:szCs w:val="24"/>
+                <w:lang w:val="es-CL"/>
               </w:rPr>
             </w:pPr>
             <w:r>
@@ -13735,32 +13868,27 @@
                 <w:color w:val="auto"/>
                 <w:sz w:val="24"/>
                 <w:szCs w:val="24"/>
-              </w:rPr>
-              <w:t>Entorno reproducible y dependencias</w:t>
+                <w:lang w:val="es-CL"/>
+              </w:rPr>
+              <w:t>Entorno reproducible</w:t>
             </w:r>
           </w:p>
         </w:tc>
         <w:tc>
           <w:tcPr>
-            <w:tcW w:w="2160" w:type="dxa"/>
-            <w:shd w:val="clear" w:color="auto" w:fill="FFFFFF"/>
-            <w:tcMar>
-              <w:top w:w="90" w:type="dxa"/>
-              <w:left w:w="90" w:type="dxa"/>
-              <w:bottom w:w="90" w:type="dxa"/>
-              <w:right w:w="90" w:type="dxa"/>
-            </w:tcMar>
+            <w:tcW w:w="0" w:type="auto"/>
             <w:vAlign w:val="center"/>
+            <w:hideMark/>
           </w:tcPr>
           <w:p>
             <w:pPr>
-              <w:spacing w:after="40"/>
               <w:jc w:val="both"/>
               <w:rPr>
                 <w:rFonts w:ascii="Arial" w:hAnsi="Arial"/>
                 <w:color w:val="auto"/>
                 <w:sz w:val="24"/>
                 <w:szCs w:val="24"/>
+                <w:lang w:val="es-CL"/>
               </w:rPr>
             </w:pPr>
             <w:r>
@@ -13769,32 +13897,27 @@
                 <w:color w:val="auto"/>
                 <w:sz w:val="24"/>
                 <w:szCs w:val="24"/>
-              </w:rPr>
-              <w:t>Implementado (F1)</w:t>
+                <w:lang w:val="es-CL"/>
+              </w:rPr>
+              <w:t>Se configuraron Python, el entorno virtual y las dependencias</w:t>
             </w:r>
           </w:p>
         </w:tc>
         <w:tc>
           <w:tcPr>
-            <w:tcW w:w="4752" w:type="dxa"/>
-            <w:shd w:val="clear" w:color="auto" w:fill="FFFFFF"/>
-            <w:tcMar>
-              <w:top w:w="90" w:type="dxa"/>
-              <w:left w:w="90" w:type="dxa"/>
-              <w:bottom w:w="90" w:type="dxa"/>
-              <w:right w:w="90" w:type="dxa"/>
-            </w:tcMar>
+            <w:tcW w:w="0" w:type="auto"/>
             <w:vAlign w:val="center"/>
+            <w:hideMark/>
           </w:tcPr>
           <w:p>
             <w:pPr>
-              <w:spacing w:after="40"/>
               <w:jc w:val="both"/>
               <w:rPr>
                 <w:rFonts w:ascii="Arial" w:hAnsi="Arial"/>
                 <w:color w:val="auto"/>
                 <w:sz w:val="24"/>
                 <w:szCs w:val="24"/>
+                <w:lang w:val="es-CL"/>
               </w:rPr>
             </w:pPr>
             <w:r>
@@ -13803,103 +13926,74 @@
                 <w:color w:val="auto"/>
                 <w:sz w:val="24"/>
                 <w:szCs w:val="24"/>
-              </w:rPr>
-              <w:t xml:space="preserve">requirements.txt, README.md </w:t>
-            </w:r>
-            <w:proofErr w:type="gramStart"/>
-            <w:r>
-              <w:rPr>
-                <w:rFonts w:ascii="Arial" w:hAnsi="Arial"/>
-                <w:color w:val="auto"/>
-                <w:sz w:val="24"/>
-                <w:szCs w:val="24"/>
-              </w:rPr>
-              <w:t>y .</w:t>
-            </w:r>
-            <w:proofErr w:type="spellStart"/>
-            <w:r>
-              <w:rPr>
-                <w:rFonts w:ascii="Arial" w:hAnsi="Arial"/>
-                <w:color w:val="auto"/>
-                <w:sz w:val="24"/>
-                <w:szCs w:val="24"/>
-              </w:rPr>
-              <w:t>venv</w:t>
-            </w:r>
-            <w:proofErr w:type="spellEnd"/>
-            <w:proofErr w:type="gramEnd"/>
-            <w:r>
-              <w:rPr>
-                <w:rFonts w:ascii="Arial" w:hAnsi="Arial"/>
-                <w:color w:val="auto"/>
-                <w:sz w:val="24"/>
-                <w:szCs w:val="24"/>
-              </w:rPr>
-              <w:t xml:space="preserve"> verificado en Python 3.12</w:t>
+                <w:lang w:val="es-CL"/>
+              </w:rPr>
+              <w:t>requirements.txt y README.md</w:t>
             </w:r>
           </w:p>
         </w:tc>
       </w:tr>
       <w:tr>
         <w:trPr>
-          <w:cantSplit/>
-          <w:jc w:val="center"/>
+          <w:tblCellSpacing w:w="15" w:type="dxa"/>
         </w:trPr>
         <w:tc>
           <w:tcPr>
-            <w:tcW w:w="3168" w:type="dxa"/>
-            <w:shd w:val="clear" w:color="auto" w:fill="F9FAFB"/>
-            <w:tcMar>
-              <w:top w:w="90" w:type="dxa"/>
-              <w:left w:w="90" w:type="dxa"/>
-              <w:bottom w:w="90" w:type="dxa"/>
-              <w:right w:w="90" w:type="dxa"/>
-            </w:tcMar>
+            <w:tcW w:w="0" w:type="auto"/>
             <w:vAlign w:val="center"/>
+            <w:hideMark/>
           </w:tcPr>
           <w:p>
             <w:pPr>
-              <w:spacing w:after="40"/>
               <w:jc w:val="both"/>
               <w:rPr>
                 <w:rFonts w:ascii="Arial" w:hAnsi="Arial"/>
                 <w:color w:val="auto"/>
                 <w:sz w:val="24"/>
                 <w:szCs w:val="24"/>
+                <w:lang w:val="es-CL"/>
               </w:rPr>
             </w:pPr>
-            <w:r>
-              <w:rPr>
-                <w:rFonts w:ascii="Arial" w:hAnsi="Arial"/>
-                <w:color w:val="auto"/>
-                <w:sz w:val="24"/>
-                <w:szCs w:val="24"/>
-              </w:rPr>
-              <w:t>Código modular y contrato de entrada</w:t>
+            <w:proofErr w:type="spellStart"/>
+            <w:r>
+              <w:rPr>
+                <w:rFonts w:ascii="Arial" w:hAnsi="Arial"/>
+                <w:color w:val="auto"/>
+                <w:sz w:val="24"/>
+                <w:szCs w:val="24"/>
+                <w:lang w:val="es-CL"/>
+              </w:rPr>
+              <w:lastRenderedPageBreak/>
+              <w:t>Jupyter</w:t>
+            </w:r>
+            <w:proofErr w:type="spellEnd"/>
+            <w:r>
+              <w:rPr>
+                <w:rFonts w:ascii="Arial" w:hAnsi="Arial"/>
+                <w:color w:val="auto"/>
+                <w:sz w:val="24"/>
+                <w:szCs w:val="24"/>
+                <w:lang w:val="es-CL"/>
+              </w:rPr>
+              <w:t xml:space="preserve"> Notebook</w:t>
             </w:r>
           </w:p>
         </w:tc>
         <w:tc>
           <w:tcPr>
-            <w:tcW w:w="2160" w:type="dxa"/>
-            <w:shd w:val="clear" w:color="auto" w:fill="F9FAFB"/>
-            <w:tcMar>
-              <w:top w:w="90" w:type="dxa"/>
-              <w:left w:w="90" w:type="dxa"/>
-              <w:bottom w:w="90" w:type="dxa"/>
-              <w:right w:w="90" w:type="dxa"/>
-            </w:tcMar>
+            <w:tcW w:w="0" w:type="auto"/>
             <w:vAlign w:val="center"/>
+            <w:hideMark/>
           </w:tcPr>
           <w:p>
             <w:pPr>
-              <w:spacing w:after="40"/>
               <w:jc w:val="both"/>
               <w:rPr>
                 <w:rFonts w:ascii="Arial" w:hAnsi="Arial"/>
                 <w:color w:val="auto"/>
                 <w:sz w:val="24"/>
                 <w:szCs w:val="24"/>
+                <w:lang w:val="es-CL"/>
               </w:rPr>
             </w:pPr>
             <w:r>
@@ -13908,32 +14002,27 @@
                 <w:color w:val="auto"/>
                 <w:sz w:val="24"/>
                 <w:szCs w:val="24"/>
-              </w:rPr>
-              <w:t>Implementado (F1/F2)</w:t>
+                <w:lang w:val="es-CL"/>
+              </w:rPr>
+              <w:t>Se integraron explicaciones, código, resultados y pruebas</w:t>
             </w:r>
           </w:p>
         </w:tc>
         <w:tc>
           <w:tcPr>
-            <w:tcW w:w="4752" w:type="dxa"/>
-            <w:shd w:val="clear" w:color="auto" w:fill="F9FAFB"/>
-            <w:tcMar>
-              <w:top w:w="90" w:type="dxa"/>
-              <w:left w:w="90" w:type="dxa"/>
-              <w:bottom w:w="90" w:type="dxa"/>
-              <w:right w:w="90" w:type="dxa"/>
-            </w:tcMar>
+            <w:tcW w:w="0" w:type="auto"/>
             <w:vAlign w:val="center"/>
+            <w:hideMark/>
           </w:tcPr>
           <w:p>
             <w:pPr>
-              <w:spacing w:after="40"/>
               <w:jc w:val="both"/>
               <w:rPr>
                 <w:rFonts w:ascii="Arial" w:hAnsi="Arial"/>
                 <w:color w:val="auto"/>
                 <w:sz w:val="24"/>
                 <w:szCs w:val="24"/>
+                <w:lang w:val="es-CL"/>
               </w:rPr>
             </w:pPr>
             <w:r>
@@ -13942,58 +14031,32 @@
                 <w:color w:val="auto"/>
                 <w:sz w:val="24"/>
                 <w:szCs w:val="24"/>
-              </w:rPr>
-              <w:t>src/proyecto.py (</w:t>
-            </w:r>
-            <w:proofErr w:type="spellStart"/>
-            <w:r>
-              <w:rPr>
-                <w:rFonts w:ascii="Arial" w:hAnsi="Arial"/>
-                <w:color w:val="auto"/>
-                <w:sz w:val="24"/>
-                <w:szCs w:val="24"/>
-              </w:rPr>
-              <w:t>versiones_entorno</w:t>
-            </w:r>
-            <w:proofErr w:type="spellEnd"/>
-            <w:r>
-              <w:rPr>
-                <w:rFonts w:ascii="Arial" w:hAnsi="Arial"/>
-                <w:color w:val="auto"/>
-                <w:sz w:val="24"/>
-                <w:szCs w:val="24"/>
-              </w:rPr>
-              <w:t>, sha256, leer_datos_f1, limpiar_f2)</w:t>
+                <w:lang w:val="es-CL"/>
+              </w:rPr>
+              <w:t>Notebooks de F1 y F2</w:t>
             </w:r>
           </w:p>
         </w:tc>
       </w:tr>
       <w:tr>
         <w:trPr>
-          <w:cantSplit/>
-          <w:jc w:val="center"/>
+          <w:tblCellSpacing w:w="15" w:type="dxa"/>
         </w:trPr>
         <w:tc>
           <w:tcPr>
-            <w:tcW w:w="3168" w:type="dxa"/>
-            <w:shd w:val="clear" w:color="auto" w:fill="FFFFFF"/>
-            <w:tcMar>
-              <w:top w:w="90" w:type="dxa"/>
-              <w:left w:w="90" w:type="dxa"/>
-              <w:bottom w:w="90" w:type="dxa"/>
-              <w:right w:w="90" w:type="dxa"/>
-            </w:tcMar>
+            <w:tcW w:w="0" w:type="auto"/>
             <w:vAlign w:val="center"/>
+            <w:hideMark/>
           </w:tcPr>
           <w:p>
             <w:pPr>
-              <w:spacing w:after="40"/>
               <w:jc w:val="both"/>
               <w:rPr>
                 <w:rFonts w:ascii="Arial" w:hAnsi="Arial"/>
                 <w:color w:val="auto"/>
                 <w:sz w:val="24"/>
                 <w:szCs w:val="24"/>
+                <w:lang w:val="es-CL"/>
               </w:rPr>
             </w:pPr>
             <w:r>
@@ -14002,32 +14065,27 @@
                 <w:color w:val="auto"/>
                 <w:sz w:val="24"/>
                 <w:szCs w:val="24"/>
-              </w:rPr>
-              <w:t>Exploración, diagnóstico y diccionario</w:t>
+                <w:lang w:val="es-CL"/>
+              </w:rPr>
+              <w:t>Git y GitHub</w:t>
             </w:r>
           </w:p>
         </w:tc>
         <w:tc>
           <w:tcPr>
-            <w:tcW w:w="2160" w:type="dxa"/>
-            <w:shd w:val="clear" w:color="auto" w:fill="FFFFFF"/>
-            <w:tcMar>
-              <w:top w:w="90" w:type="dxa"/>
-              <w:left w:w="90" w:type="dxa"/>
-              <w:bottom w:w="90" w:type="dxa"/>
-              <w:right w:w="90" w:type="dxa"/>
-            </w:tcMar>
+            <w:tcW w:w="0" w:type="auto"/>
             <w:vAlign w:val="center"/>
+            <w:hideMark/>
           </w:tcPr>
           <w:p>
             <w:pPr>
-              <w:spacing w:after="40"/>
               <w:jc w:val="both"/>
               <w:rPr>
                 <w:rFonts w:ascii="Arial" w:hAnsi="Arial"/>
                 <w:color w:val="auto"/>
                 <w:sz w:val="24"/>
                 <w:szCs w:val="24"/>
+                <w:lang w:val="es-CL"/>
               </w:rPr>
             </w:pPr>
             <w:r>
@@ -14036,32 +14094,27 @@
                 <w:color w:val="auto"/>
                 <w:sz w:val="24"/>
                 <w:szCs w:val="24"/>
-              </w:rPr>
-              <w:t>Implementado (F2)</w:t>
+                <w:lang w:val="es-CL"/>
+              </w:rPr>
+              <w:t>Cada integrante trabaja en su rama y los cambios se integran mediante PR</w:t>
             </w:r>
           </w:p>
         </w:tc>
         <w:tc>
           <w:tcPr>
-            <w:tcW w:w="4752" w:type="dxa"/>
-            <w:shd w:val="clear" w:color="auto" w:fill="FFFFFF"/>
-            <w:tcMar>
-              <w:top w:w="90" w:type="dxa"/>
-              <w:left w:w="90" w:type="dxa"/>
-              <w:bottom w:w="90" w:type="dxa"/>
-              <w:right w:w="90" w:type="dxa"/>
-            </w:tcMar>
+            <w:tcW w:w="0" w:type="auto"/>
             <w:vAlign w:val="center"/>
+            <w:hideMark/>
           </w:tcPr>
           <w:p>
             <w:pPr>
-              <w:spacing w:after="40"/>
               <w:jc w:val="both"/>
               <w:rPr>
                 <w:rFonts w:ascii="Arial" w:hAnsi="Arial"/>
                 <w:color w:val="auto"/>
                 <w:sz w:val="24"/>
                 <w:szCs w:val="24"/>
+                <w:lang w:val="es-CL"/>
               </w:rPr>
             </w:pPr>
             <w:r>
@@ -14070,38 +14123,32 @@
                 <w:color w:val="auto"/>
                 <w:sz w:val="24"/>
                 <w:szCs w:val="24"/>
-              </w:rPr>
-              <w:t>data/DICCIONARIO_VARIABLES.md y F2/F2_Preprocesamiento.ipynb</w:t>
+                <w:lang w:val="es-CL"/>
+              </w:rPr>
+              <w:t>Repositorio e historial de GitHub</w:t>
             </w:r>
           </w:p>
         </w:tc>
       </w:tr>
       <w:tr>
         <w:trPr>
-          <w:cantSplit/>
-          <w:jc w:val="center"/>
+          <w:tblCellSpacing w:w="15" w:type="dxa"/>
         </w:trPr>
         <w:tc>
           <w:tcPr>
-            <w:tcW w:w="3168" w:type="dxa"/>
-            <w:shd w:val="clear" w:color="auto" w:fill="F9FAFB"/>
-            <w:tcMar>
-              <w:top w:w="90" w:type="dxa"/>
-              <w:left w:w="90" w:type="dxa"/>
-              <w:bottom w:w="90" w:type="dxa"/>
-              <w:right w:w="90" w:type="dxa"/>
-            </w:tcMar>
+            <w:tcW w:w="0" w:type="auto"/>
             <w:vAlign w:val="center"/>
+            <w:hideMark/>
           </w:tcPr>
           <w:p>
             <w:pPr>
-              <w:spacing w:after="40"/>
               <w:jc w:val="both"/>
               <w:rPr>
                 <w:rFonts w:ascii="Arial" w:hAnsi="Arial"/>
                 <w:color w:val="auto"/>
                 <w:sz w:val="24"/>
                 <w:szCs w:val="24"/>
+                <w:lang w:val="es-CL"/>
               </w:rPr>
             </w:pPr>
             <w:r>
@@ -14110,32 +14157,27 @@
                 <w:color w:val="auto"/>
                 <w:sz w:val="24"/>
                 <w:szCs w:val="24"/>
-              </w:rPr>
-              <w:t>Limpieza de NA, fechas anómalas y transformaciones</w:t>
+                <w:lang w:val="es-CL"/>
+              </w:rPr>
+              <w:t>Estructura y trazabilidad</w:t>
             </w:r>
           </w:p>
         </w:tc>
         <w:tc>
           <w:tcPr>
-            <w:tcW w:w="2160" w:type="dxa"/>
-            <w:shd w:val="clear" w:color="auto" w:fill="F9FAFB"/>
-            <w:tcMar>
-              <w:top w:w="90" w:type="dxa"/>
-              <w:left w:w="90" w:type="dxa"/>
-              <w:bottom w:w="90" w:type="dxa"/>
-              <w:right w:w="90" w:type="dxa"/>
-            </w:tcMar>
+            <w:tcW w:w="0" w:type="auto"/>
             <w:vAlign w:val="center"/>
+            <w:hideMark/>
           </w:tcPr>
           <w:p>
             <w:pPr>
-              <w:spacing w:after="40"/>
               <w:jc w:val="both"/>
               <w:rPr>
                 <w:rFonts w:ascii="Arial" w:hAnsi="Arial"/>
                 <w:color w:val="auto"/>
                 <w:sz w:val="24"/>
                 <w:szCs w:val="24"/>
+                <w:lang w:val="es-CL"/>
               </w:rPr>
             </w:pPr>
             <w:r>
@@ -14144,32 +14186,27 @@
                 <w:color w:val="auto"/>
                 <w:sz w:val="24"/>
                 <w:szCs w:val="24"/>
-              </w:rPr>
-              <w:t>Implementado (F2)</w:t>
+                <w:lang w:val="es-CL"/>
+              </w:rPr>
+              <w:t>Se organizaron datos originales, datos procesados, código y evidencias</w:t>
             </w:r>
           </w:p>
         </w:tc>
         <w:tc>
           <w:tcPr>
-            <w:tcW w:w="4752" w:type="dxa"/>
-            <w:shd w:val="clear" w:color="auto" w:fill="F9FAFB"/>
-            <w:tcMar>
-              <w:top w:w="90" w:type="dxa"/>
-              <w:left w:w="90" w:type="dxa"/>
-              <w:bottom w:w="90" w:type="dxa"/>
-              <w:right w:w="90" w:type="dxa"/>
-            </w:tcMar>
+            <w:tcW w:w="0" w:type="auto"/>
             <w:vAlign w:val="center"/>
+            <w:hideMark/>
           </w:tcPr>
           <w:p>
             <w:pPr>
-              <w:spacing w:after="40"/>
               <w:jc w:val="both"/>
               <w:rPr>
                 <w:rFonts w:ascii="Arial" w:hAnsi="Arial"/>
                 <w:color w:val="auto"/>
                 <w:sz w:val="24"/>
                 <w:szCs w:val="24"/>
+                <w:lang w:val="es-CL"/>
               </w:rPr>
             </w:pPr>
             <w:r>
@@ -14178,83 +14215,105 @@
                 <w:color w:val="auto"/>
                 <w:sz w:val="24"/>
                 <w:szCs w:val="24"/>
-              </w:rPr>
-              <w:t>src/proyecto.py (limpiar_datos_f2) y F2_Preprocesamiento.ipynb</w:t>
+                <w:lang w:val="es-CL"/>
+              </w:rPr>
+              <w:t xml:space="preserve">data/, </w:t>
+            </w:r>
+            <w:proofErr w:type="spellStart"/>
+            <w:r>
+              <w:rPr>
+                <w:rFonts w:ascii="Arial" w:hAnsi="Arial"/>
+                <w:color w:val="auto"/>
+                <w:sz w:val="24"/>
+                <w:szCs w:val="24"/>
+                <w:lang w:val="es-CL"/>
+              </w:rPr>
+              <w:t>src</w:t>
+            </w:r>
+            <w:proofErr w:type="spellEnd"/>
+            <w:r>
+              <w:rPr>
+                <w:rFonts w:ascii="Arial" w:hAnsi="Arial"/>
+                <w:color w:val="auto"/>
+                <w:sz w:val="24"/>
+                <w:szCs w:val="24"/>
+                <w:lang w:val="es-CL"/>
+              </w:rPr>
+              <w:t xml:space="preserve">/, </w:t>
+            </w:r>
+            <w:proofErr w:type="spellStart"/>
+            <w:r>
+              <w:rPr>
+                <w:rFonts w:ascii="Arial" w:hAnsi="Arial"/>
+                <w:color w:val="auto"/>
+                <w:sz w:val="24"/>
+                <w:szCs w:val="24"/>
+                <w:lang w:val="es-CL"/>
+              </w:rPr>
+              <w:t>docs</w:t>
+            </w:r>
+            <w:proofErr w:type="spellEnd"/>
+            <w:r>
+              <w:rPr>
+                <w:rFonts w:ascii="Arial" w:hAnsi="Arial"/>
+                <w:color w:val="auto"/>
+                <w:sz w:val="24"/>
+                <w:szCs w:val="24"/>
+                <w:lang w:val="es-CL"/>
+              </w:rPr>
+              <w:t>/ y evidencias/</w:t>
             </w:r>
           </w:p>
         </w:tc>
       </w:tr>
       <w:tr>
         <w:trPr>
-          <w:cantSplit/>
-          <w:jc w:val="center"/>
+          <w:tblCellSpacing w:w="15" w:type="dxa"/>
         </w:trPr>
         <w:tc>
           <w:tcPr>
-            <w:tcW w:w="3168" w:type="dxa"/>
-            <w:shd w:val="clear" w:color="auto" w:fill="FFFFFF"/>
-            <w:tcMar>
-              <w:top w:w="90" w:type="dxa"/>
-              <w:left w:w="90" w:type="dxa"/>
-              <w:bottom w:w="90" w:type="dxa"/>
-              <w:right w:w="90" w:type="dxa"/>
-            </w:tcMar>
+            <w:tcW w:w="0" w:type="auto"/>
             <w:vAlign w:val="center"/>
+            <w:hideMark/>
           </w:tcPr>
           <w:p>
             <w:pPr>
-              <w:spacing w:after="40"/>
               <w:jc w:val="both"/>
               <w:rPr>
                 <w:rFonts w:ascii="Arial" w:hAnsi="Arial"/>
                 <w:color w:val="auto"/>
                 <w:sz w:val="24"/>
                 <w:szCs w:val="24"/>
+                <w:lang w:val="es-CL"/>
               </w:rPr>
             </w:pPr>
-            <w:proofErr w:type="spellStart"/>
-            <w:r>
-              <w:rPr>
-                <w:rFonts w:ascii="Arial" w:hAnsi="Arial"/>
-                <w:color w:val="auto"/>
-                <w:sz w:val="24"/>
-                <w:szCs w:val="24"/>
-              </w:rPr>
-              <w:t>Dataset</w:t>
-            </w:r>
-            <w:proofErr w:type="spellEnd"/>
-            <w:r>
-              <w:rPr>
-                <w:rFonts w:ascii="Arial" w:hAnsi="Arial"/>
-                <w:color w:val="auto"/>
-                <w:sz w:val="24"/>
-                <w:szCs w:val="24"/>
-              </w:rPr>
-              <w:t xml:space="preserve"> procesado derivado y trazable</w:t>
+            <w:r>
+              <w:rPr>
+                <w:rFonts w:ascii="Arial" w:hAnsi="Arial"/>
+                <w:color w:val="auto"/>
+                <w:sz w:val="24"/>
+                <w:szCs w:val="24"/>
+                <w:lang w:val="es-CL"/>
+              </w:rPr>
+              <w:t>Documentación científica</w:t>
             </w:r>
           </w:p>
         </w:tc>
         <w:tc>
           <w:tcPr>
-            <w:tcW w:w="2160" w:type="dxa"/>
-            <w:shd w:val="clear" w:color="auto" w:fill="FFFFFF"/>
-            <w:tcMar>
-              <w:top w:w="90" w:type="dxa"/>
-              <w:left w:w="90" w:type="dxa"/>
-              <w:bottom w:w="90" w:type="dxa"/>
-              <w:right w:w="90" w:type="dxa"/>
-            </w:tcMar>
+            <w:tcW w:w="0" w:type="auto"/>
             <w:vAlign w:val="center"/>
+            <w:hideMark/>
           </w:tcPr>
           <w:p>
             <w:pPr>
-              <w:spacing w:after="40"/>
               <w:jc w:val="both"/>
               <w:rPr>
                 <w:rFonts w:ascii="Arial" w:hAnsi="Arial"/>
                 <w:color w:val="auto"/>
                 <w:sz w:val="24"/>
                 <w:szCs w:val="24"/>
+                <w:lang w:val="es-CL"/>
               </w:rPr>
             </w:pPr>
             <w:r>
@@ -14263,32 +14322,27 @@
                 <w:color w:val="auto"/>
                 <w:sz w:val="24"/>
                 <w:szCs w:val="24"/>
-              </w:rPr>
-              <w:t>Implementado (F2)</w:t>
+                <w:lang w:val="es-CL"/>
+              </w:rPr>
+              <w:t>Se documentaron decisiones, procedimientos, limitaciones y fuentes</w:t>
             </w:r>
           </w:p>
         </w:tc>
         <w:tc>
           <w:tcPr>
-            <w:tcW w:w="4752" w:type="dxa"/>
-            <w:shd w:val="clear" w:color="auto" w:fill="FFFFFF"/>
-            <w:tcMar>
-              <w:top w:w="90" w:type="dxa"/>
-              <w:left w:w="90" w:type="dxa"/>
-              <w:bottom w:w="90" w:type="dxa"/>
-              <w:right w:w="90" w:type="dxa"/>
-            </w:tcMar>
+            <w:tcW w:w="0" w:type="auto"/>
             <w:vAlign w:val="center"/>
+            <w:hideMark/>
           </w:tcPr>
           <w:p>
             <w:pPr>
-              <w:spacing w:after="40"/>
               <w:jc w:val="both"/>
               <w:rPr>
                 <w:rFonts w:ascii="Arial" w:hAnsi="Arial"/>
                 <w:color w:val="auto"/>
                 <w:sz w:val="24"/>
                 <w:szCs w:val="24"/>
+                <w:lang w:val="es-CL"/>
               </w:rPr>
             </w:pPr>
             <w:r>
@@ -14297,8 +14351,9 @@
                 <w:color w:val="auto"/>
                 <w:sz w:val="24"/>
                 <w:szCs w:val="24"/>
-              </w:rPr>
-              <w:t>data/</w:t>
+                <w:lang w:val="es-CL"/>
+              </w:rPr>
+              <w:t xml:space="preserve">Celdas </w:t>
             </w:r>
             <w:proofErr w:type="spellStart"/>
             <w:r>
@@ -14307,8 +14362,9 @@
                 <w:color w:val="auto"/>
                 <w:sz w:val="24"/>
                 <w:szCs w:val="24"/>
-              </w:rPr>
-              <w:t>processed</w:t>
+                <w:lang w:val="es-CL"/>
+              </w:rPr>
+              <w:t>Markdown</w:t>
             </w:r>
             <w:proofErr w:type="spellEnd"/>
             <w:r>
@@ -14317,38 +14373,32 @@
                 <w:color w:val="auto"/>
                 <w:sz w:val="24"/>
                 <w:szCs w:val="24"/>
-              </w:rPr>
-              <w:t>/licitaciones_salud_marzo_2026_procesado.csv</w:t>
+                <w:lang w:val="es-CL"/>
+              </w:rPr>
+              <w:t>, README e informe</w:t>
             </w:r>
           </w:p>
         </w:tc>
       </w:tr>
       <w:tr>
         <w:trPr>
-          <w:cantSplit/>
-          <w:jc w:val="center"/>
+          <w:tblCellSpacing w:w="15" w:type="dxa"/>
         </w:trPr>
         <w:tc>
           <w:tcPr>
-            <w:tcW w:w="3168" w:type="dxa"/>
-            <w:shd w:val="clear" w:color="auto" w:fill="F9FAFB"/>
-            <w:tcMar>
-              <w:top w:w="90" w:type="dxa"/>
-              <w:left w:w="90" w:type="dxa"/>
-              <w:bottom w:w="90" w:type="dxa"/>
-              <w:right w:w="90" w:type="dxa"/>
-            </w:tcMar>
+            <w:tcW w:w="0" w:type="auto"/>
             <w:vAlign w:val="center"/>
+            <w:hideMark/>
           </w:tcPr>
           <w:p>
             <w:pPr>
-              <w:spacing w:after="40"/>
               <w:jc w:val="both"/>
               <w:rPr>
                 <w:rFonts w:ascii="Arial" w:hAnsi="Arial"/>
                 <w:color w:val="auto"/>
                 <w:sz w:val="24"/>
                 <w:szCs w:val="24"/>
+                <w:lang w:val="es-CL"/>
               </w:rPr>
             </w:pPr>
             <w:r>
@@ -14357,33 +14407,27 @@
                 <w:color w:val="auto"/>
                 <w:sz w:val="24"/>
                 <w:szCs w:val="24"/>
-              </w:rPr>
-              <w:lastRenderedPageBreak/>
-              <w:t>Evidencias de ejecución sin errores</w:t>
+                <w:lang w:val="es-CL"/>
+              </w:rPr>
+              <w:t>Trabajo en equipo y protección</w:t>
             </w:r>
           </w:p>
         </w:tc>
         <w:tc>
           <w:tcPr>
-            <w:tcW w:w="2160" w:type="dxa"/>
-            <w:shd w:val="clear" w:color="auto" w:fill="F9FAFB"/>
-            <w:tcMar>
-              <w:top w:w="90" w:type="dxa"/>
-              <w:left w:w="90" w:type="dxa"/>
-              <w:bottom w:w="90" w:type="dxa"/>
-              <w:right w:w="90" w:type="dxa"/>
-            </w:tcMar>
+            <w:tcW w:w="0" w:type="auto"/>
             <w:vAlign w:val="center"/>
+            <w:hideMark/>
           </w:tcPr>
           <w:p>
             <w:pPr>
-              <w:spacing w:after="40"/>
               <w:jc w:val="both"/>
               <w:rPr>
                 <w:rFonts w:ascii="Arial" w:hAnsi="Arial"/>
                 <w:color w:val="auto"/>
                 <w:sz w:val="24"/>
                 <w:szCs w:val="24"/>
+                <w:lang w:val="es-CL"/>
               </w:rPr>
             </w:pPr>
             <w:r>
@@ -14392,32 +14436,39 @@
                 <w:color w:val="auto"/>
                 <w:sz w:val="24"/>
                 <w:szCs w:val="24"/>
-              </w:rPr>
-              <w:t>Implementado (F1/F2)</w:t>
-            </w:r>
+                <w:lang w:val="es-CL"/>
+              </w:rPr>
+              <w:t xml:space="preserve">Se definió el flujo rama individual → desarrollo → </w:t>
+            </w:r>
+            <w:proofErr w:type="spellStart"/>
+            <w:r>
+              <w:rPr>
+                <w:rFonts w:ascii="Arial" w:hAnsi="Arial"/>
+                <w:color w:val="auto"/>
+                <w:sz w:val="24"/>
+                <w:szCs w:val="24"/>
+                <w:lang w:val="es-CL"/>
+              </w:rPr>
+              <w:t>main</w:t>
+            </w:r>
+            <w:proofErr w:type="spellEnd"/>
           </w:p>
         </w:tc>
         <w:tc>
           <w:tcPr>
-            <w:tcW w:w="4752" w:type="dxa"/>
-            <w:shd w:val="clear" w:color="auto" w:fill="F9FAFB"/>
-            <w:tcMar>
-              <w:top w:w="90" w:type="dxa"/>
-              <w:left w:w="90" w:type="dxa"/>
-              <w:bottom w:w="90" w:type="dxa"/>
-              <w:right w:w="90" w:type="dxa"/>
-            </w:tcMar>
+            <w:tcW w:w="0" w:type="auto"/>
             <w:vAlign w:val="center"/>
+            <w:hideMark/>
           </w:tcPr>
           <w:p>
             <w:pPr>
-              <w:spacing w:after="40"/>
               <w:jc w:val="both"/>
               <w:rPr>
                 <w:rFonts w:ascii="Arial" w:hAnsi="Arial"/>
                 <w:color w:val="auto"/>
                 <w:sz w:val="24"/>
                 <w:szCs w:val="24"/>
+                <w:lang w:val="es-CL"/>
               </w:rPr>
             </w:pPr>
             <w:r>
@@ -14426,38 +14477,66 @@
                 <w:color w:val="auto"/>
                 <w:sz w:val="24"/>
                 <w:szCs w:val="24"/>
-              </w:rPr>
-              <w:t>evidencias/F1_ejecucion.json y evidencias/F2_ejecucion.json</w:t>
-            </w:r>
+                <w:lang w:val="es-CL"/>
+              </w:rPr>
+              <w:t xml:space="preserve">Políticas de ramas y </w:t>
+            </w:r>
+            <w:proofErr w:type="spellStart"/>
+            <w:r>
+              <w:rPr>
+                <w:rFonts w:ascii="Arial" w:hAnsi="Arial"/>
+                <w:color w:val="auto"/>
+                <w:sz w:val="24"/>
+                <w:szCs w:val="24"/>
+                <w:lang w:val="es-CL"/>
+              </w:rPr>
+              <w:t>pull</w:t>
+            </w:r>
+            <w:proofErr w:type="spellEnd"/>
+            <w:r>
+              <w:rPr>
+                <w:rFonts w:ascii="Arial" w:hAnsi="Arial"/>
+                <w:color w:val="auto"/>
+                <w:sz w:val="24"/>
+                <w:szCs w:val="24"/>
+                <w:lang w:val="es-CL"/>
+              </w:rPr>
+              <w:t xml:space="preserve"> </w:t>
+            </w:r>
+            <w:proofErr w:type="spellStart"/>
+            <w:r>
+              <w:rPr>
+                <w:rFonts w:ascii="Arial" w:hAnsi="Arial"/>
+                <w:color w:val="auto"/>
+                <w:sz w:val="24"/>
+                <w:szCs w:val="24"/>
+                <w:lang w:val="es-CL"/>
+              </w:rPr>
+              <w:t>requests</w:t>
+            </w:r>
+            <w:proofErr w:type="spellEnd"/>
           </w:p>
         </w:tc>
       </w:tr>
       <w:tr>
         <w:trPr>
-          <w:cantSplit/>
-          <w:jc w:val="center"/>
+          <w:tblCellSpacing w:w="15" w:type="dxa"/>
         </w:trPr>
         <w:tc>
           <w:tcPr>
-            <w:tcW w:w="3168" w:type="dxa"/>
-            <w:shd w:val="clear" w:color="auto" w:fill="FFFFFF"/>
-            <w:tcMar>
-              <w:top w:w="90" w:type="dxa"/>
-              <w:left w:w="90" w:type="dxa"/>
-              <w:bottom w:w="90" w:type="dxa"/>
-              <w:right w:w="90" w:type="dxa"/>
-            </w:tcMar>
+            <w:tcW w:w="0" w:type="auto"/>
             <w:vAlign w:val="center"/>
+            <w:hideMark/>
           </w:tcPr>
           <w:p>
             <w:pPr>
-              <w:spacing w:after="40"/>
               <w:jc w:val="both"/>
               <w:rPr>
                 <w:rFonts w:ascii="Arial" w:hAnsi="Arial"/>
                 <w:color w:val="auto"/>
                 <w:sz w:val="24"/>
                 <w:szCs w:val="24"/>
+                <w:lang w:val="es-CL"/>
               </w:rPr>
             </w:pPr>
             <w:r>
@@ -14466,32 +14545,27 @@
                 <w:color w:val="auto"/>
                 <w:sz w:val="24"/>
                 <w:szCs w:val="24"/>
-              </w:rPr>
-              <w:t>Análisis estadístico bivariado y visualización</w:t>
+                <w:lang w:val="es-CL"/>
+              </w:rPr>
+              <w:t>Continuidad del proyecto</w:t>
             </w:r>
           </w:p>
         </w:tc>
         <w:tc>
           <w:tcPr>
-            <w:tcW w:w="2160" w:type="dxa"/>
-            <w:shd w:val="clear" w:color="auto" w:fill="FFFFFF"/>
-            <w:tcMar>
-              <w:top w:w="90" w:type="dxa"/>
-              <w:left w:w="90" w:type="dxa"/>
-              <w:bottom w:w="90" w:type="dxa"/>
-              <w:right w:w="90" w:type="dxa"/>
-            </w:tcMar>
+            <w:tcW w:w="0" w:type="auto"/>
             <w:vAlign w:val="center"/>
+            <w:hideMark/>
           </w:tcPr>
           <w:p>
             <w:pPr>
-              <w:spacing w:after="40"/>
               <w:jc w:val="both"/>
               <w:rPr>
                 <w:rFonts w:ascii="Arial" w:hAnsi="Arial"/>
                 <w:color w:val="auto"/>
                 <w:sz w:val="24"/>
                 <w:szCs w:val="24"/>
+                <w:lang w:val="es-CL"/>
               </w:rPr>
             </w:pPr>
             <w:r>
@@ -14500,32 +14574,27 @@
                 <w:color w:val="auto"/>
                 <w:sz w:val="24"/>
                 <w:szCs w:val="24"/>
-              </w:rPr>
-              <w:t>Proyectado (F3)</w:t>
+                <w:lang w:val="es-CL"/>
+              </w:rPr>
+              <w:t>F2 prepara y valida los datos; F3 y F4 quedan proyectadas</w:t>
             </w:r>
           </w:p>
         </w:tc>
         <w:tc>
           <w:tcPr>
-            <w:tcW w:w="4752" w:type="dxa"/>
-            <w:shd w:val="clear" w:color="auto" w:fill="FFFFFF"/>
-            <w:tcMar>
-              <w:top w:w="90" w:type="dxa"/>
-              <w:left w:w="90" w:type="dxa"/>
-              <w:bottom w:w="90" w:type="dxa"/>
-              <w:right w:w="90" w:type="dxa"/>
-            </w:tcMar>
+            <w:tcW w:w="0" w:type="auto"/>
             <w:vAlign w:val="center"/>
+            <w:hideMark/>
           </w:tcPr>
           <w:p>
             <w:pPr>
-              <w:spacing w:after="40"/>
               <w:jc w:val="both"/>
               <w:rPr>
                 <w:rFonts w:ascii="Arial" w:hAnsi="Arial"/>
                 <w:color w:val="auto"/>
                 <w:sz w:val="24"/>
                 <w:szCs w:val="24"/>
+                <w:lang w:val="es-CL"/>
               </w:rPr>
             </w:pPr>
             <w:r>
@@ -14534,127 +14603,9 @@
                 <w:color w:val="auto"/>
                 <w:sz w:val="24"/>
                 <w:szCs w:val="24"/>
-              </w:rPr>
-              <w:t>Planificado para desarrollo en semana 2 según pauta de Fase 3</w:t>
-            </w:r>
-          </w:p>
-        </w:tc>
-      </w:tr>
-      <w:tr>
-        <w:trPr>
-          <w:cantSplit/>
-          <w:jc w:val="center"/>
-        </w:trPr>
-        <w:tc>
-          <w:tcPr>
-            <w:tcW w:w="3168" w:type="dxa"/>
-            <w:shd w:val="clear" w:color="auto" w:fill="F9FAFB"/>
-            <w:tcMar>
-              <w:top w:w="90" w:type="dxa"/>
-              <w:left w:w="90" w:type="dxa"/>
-              <w:bottom w:w="90" w:type="dxa"/>
-              <w:right w:w="90" w:type="dxa"/>
-            </w:tcMar>
-            <w:vAlign w:val="center"/>
-          </w:tcPr>
-          <w:p>
-            <w:pPr>
-              <w:spacing w:after="40"/>
-              <w:jc w:val="both"/>
-              <w:rPr>
-                <w:rFonts w:ascii="Arial" w:hAnsi="Arial"/>
-                <w:color w:val="auto"/>
-                <w:sz w:val="24"/>
-                <w:szCs w:val="24"/>
-              </w:rPr>
-            </w:pPr>
-            <w:r>
-              <w:rPr>
-                <w:rFonts w:ascii="Arial" w:hAnsi="Arial"/>
-                <w:color w:val="auto"/>
-                <w:sz w:val="24"/>
-                <w:szCs w:val="24"/>
-              </w:rPr>
-              <w:t xml:space="preserve">Modelación integrada y </w:t>
-            </w:r>
-            <w:proofErr w:type="gramStart"/>
-            <w:r>
-              <w:rPr>
-                <w:rFonts w:ascii="Arial" w:hAnsi="Arial"/>
-                <w:color w:val="auto"/>
-                <w:sz w:val="24"/>
-                <w:szCs w:val="24"/>
-              </w:rPr>
-              <w:t>conclusiones finales</w:t>
-            </w:r>
-            <w:proofErr w:type="gramEnd"/>
-          </w:p>
-        </w:tc>
-        <w:tc>
-          <w:tcPr>
-            <w:tcW w:w="2160" w:type="dxa"/>
-            <w:shd w:val="clear" w:color="auto" w:fill="F9FAFB"/>
-            <w:tcMar>
-              <w:top w:w="90" w:type="dxa"/>
-              <w:left w:w="90" w:type="dxa"/>
-              <w:bottom w:w="90" w:type="dxa"/>
-              <w:right w:w="90" w:type="dxa"/>
-            </w:tcMar>
-            <w:vAlign w:val="center"/>
-          </w:tcPr>
-          <w:p>
-            <w:pPr>
-              <w:spacing w:after="40"/>
-              <w:jc w:val="both"/>
-              <w:rPr>
-                <w:rFonts w:ascii="Arial" w:hAnsi="Arial"/>
-                <w:color w:val="auto"/>
-                <w:sz w:val="24"/>
-                <w:szCs w:val="24"/>
-              </w:rPr>
-            </w:pPr>
-            <w:r>
-              <w:rPr>
-                <w:rFonts w:ascii="Arial" w:hAnsi="Arial"/>
-                <w:color w:val="auto"/>
-                <w:sz w:val="24"/>
-                <w:szCs w:val="24"/>
-              </w:rPr>
-              <w:t>Proyectado (F4)</w:t>
-            </w:r>
-          </w:p>
-        </w:tc>
-        <w:tc>
-          <w:tcPr>
-            <w:tcW w:w="4752" w:type="dxa"/>
-            <w:shd w:val="clear" w:color="auto" w:fill="F9FAFB"/>
-            <w:tcMar>
-              <w:top w:w="90" w:type="dxa"/>
-              <w:left w:w="90" w:type="dxa"/>
-              <w:bottom w:w="90" w:type="dxa"/>
-              <w:right w:w="90" w:type="dxa"/>
-            </w:tcMar>
-            <w:vAlign w:val="center"/>
-          </w:tcPr>
-          <w:p>
-            <w:pPr>
-              <w:spacing w:after="40"/>
-              <w:jc w:val="both"/>
-              <w:rPr>
-                <w:rFonts w:ascii="Arial" w:hAnsi="Arial"/>
-                <w:color w:val="auto"/>
-                <w:sz w:val="24"/>
-                <w:szCs w:val="24"/>
-              </w:rPr>
-            </w:pPr>
-            <w:r>
-              <w:rPr>
-                <w:rFonts w:ascii="Arial" w:hAnsi="Arial"/>
-                <w:color w:val="auto"/>
-                <w:sz w:val="24"/>
-                <w:szCs w:val="24"/>
-              </w:rPr>
-              <w:t>Planificado para desarrollo en semana 3 según pauta de Fase 4</w:t>
+                <w:lang w:val="es-CL"/>
+              </w:rPr>
+              <w:t>Notebook F2 y planificación del proyecto</w:t>
             </w:r>
           </w:p>
         </w:tc>
@@ -18754,7 +18705,6 @@
   <w:style w:type="character" w:default="1" w:styleId="Fuentedeprrafopredeter">
     <w:name w:val="Default Paragraph Font"/>
     <w:uiPriority w:val="1"/>
-    <w:semiHidden/>
     <w:unhideWhenUsed/>
   </w:style>
   <w:style w:type="table" w:default="1" w:styleId="Tablanormal">
@@ -19306,6 +19256,10 @@
 </file>
 
 <file path=customXml/item1.xml><?xml version="1.0" encoding="utf-8"?>
+<b:Sources xmlns:b="http://schemas.openxmlformats.org/officeDocument/2006/bibliography" xmlns="http://schemas.openxmlformats.org/officeDocument/2006/bibliography" SelectedStyle="\APASixthEditionOfficeOnline.xsl" StyleName="APA" Version="6"/>
+</file>
+
+<file path=customXml/item2.xml><?xml version="1.0" encoding="utf-8"?>
 <?mso-contentType ?>
 <FormTemplates xmlns="http://schemas.microsoft.com/sharepoint/v3/contenttype/forms">
   <Display>DocumentLibraryForm</Display>
@@ -19314,40 +19268,7 @@
 </FormTemplates>
 </file>
 
-<file path=customXml/item2.xml><?xml version="1.0" encoding="utf-8"?>
-<b:Sources xmlns:b="http://schemas.openxmlformats.org/officeDocument/2006/bibliography" xmlns="http://schemas.openxmlformats.org/officeDocument/2006/bibliography" SelectedStyle="\APASixthEditionOfficeOnline.xsl" StyleName="APA" Version="6"/>
-</file>
-
 <file path=customXml/item3.xml><?xml version="1.0" encoding="utf-8"?>
-<p:properties xmlns:p="http://schemas.microsoft.com/office/2006/metadata/properties" xmlns:xsi="http://www.w3.org/2001/XMLSchema-instance" xmlns:pc="http://schemas.microsoft.com/office/infopath/2007/PartnerControls">
-  <documentManagement>
-    <_ApprovalAssignedTo xmlns="0a2fff00-f002-44e7-b50c-b90cb65110b9">
-      <UserInfo>
-        <DisplayName/>
-        <AccountId xsi:nil="true"/>
-        <AccountType/>
-      </UserInfo>
-    </_ApprovalAssignedTo>
-    <_ApprovalStatus xmlns="0a2fff00-f002-44e7-b50c-b90cb65110b9">0</_ApprovalStatus>
-    <_ApprovalRespondedBy xmlns="0a2fff00-f002-44e7-b50c-b90cb65110b9">
-      <UserInfo>
-        <DisplayName/>
-        <AccountId xsi:nil="true"/>
-        <AccountType/>
-      </UserInfo>
-    </_ApprovalRespondedBy>
-    <_ApprovalSentBy xmlns="0a2fff00-f002-44e7-b50c-b90cb65110b9">
-      <UserInfo>
-        <DisplayName/>
-        <AccountId xsi:nil="true"/>
-        <AccountType/>
-      </UserInfo>
-    </_ApprovalSentBy>
-  </documentManagement>
-</p:properties>
-</file>
-
-<file path=customXml/item4.xml><?xml version="1.0" encoding="utf-8"?>
 <ct:contentTypeSchema xmlns:ct="http://schemas.microsoft.com/office/2006/metadata/contentType" xmlns:ma="http://schemas.microsoft.com/office/2006/metadata/properties/metaAttributes" ct:_="" ma:_="" ma:contentTypeName="Documento" ma:contentTypeID="0x010100E4D0EA28D091FE4192BEFA8519B37564" ma:contentTypeVersion="7" ma:contentTypeDescription="Crear nuevo documento." ma:contentTypeScope="" ma:versionID="8260c90b1ed25191c73397d710d0b300">
   <xsd:schema xmlns:xsd="http://www.w3.org/2001/XMLSchema" xmlns:xs="http://www.w3.org/2001/XMLSchema" xmlns:p="http://schemas.microsoft.com/office/2006/metadata/properties" xmlns:ns2="0a2fff00-f002-44e7-b50c-b90cb65110b9" targetNamespace="http://schemas.microsoft.com/office/2006/metadata/properties" ma:root="true" ma:fieldsID="0fcc4b40ac5a1efab0a1fc825461417d" ns2:_="">
     <xsd:import namespace="0a2fff00-f002-44e7-b50c-b90cb65110b9"/>
@@ -19551,7 +19472,44 @@
 </ct:contentTypeSchema>
 </file>
 
+<file path=customXml/item4.xml><?xml version="1.0" encoding="utf-8"?>
+<p:properties xmlns:p="http://schemas.microsoft.com/office/2006/metadata/properties" xmlns:xsi="http://www.w3.org/2001/XMLSchema-instance" xmlns:pc="http://schemas.microsoft.com/office/infopath/2007/PartnerControls">
+  <documentManagement>
+    <_ApprovalAssignedTo xmlns="0a2fff00-f002-44e7-b50c-b90cb65110b9">
+      <UserInfo>
+        <DisplayName/>
+        <AccountId xsi:nil="true"/>
+        <AccountType/>
+      </UserInfo>
+    </_ApprovalAssignedTo>
+    <_ApprovalStatus xmlns="0a2fff00-f002-44e7-b50c-b90cb65110b9">0</_ApprovalStatus>
+    <_ApprovalRespondedBy xmlns="0a2fff00-f002-44e7-b50c-b90cb65110b9">
+      <UserInfo>
+        <DisplayName/>
+        <AccountId xsi:nil="true"/>
+        <AccountType/>
+      </UserInfo>
+    </_ApprovalRespondedBy>
+    <_ApprovalSentBy xmlns="0a2fff00-f002-44e7-b50c-b90cb65110b9">
+      <UserInfo>
+        <DisplayName/>
+        <AccountId xsi:nil="true"/>
+        <AccountType/>
+      </UserInfo>
+    </_ApprovalSentBy>
+  </documentManagement>
+</p:properties>
+</file>
+
 <file path=customXml/itemProps1.xml><?xml version="1.0" encoding="utf-8"?>
+<ds:datastoreItem xmlns:ds="http://schemas.openxmlformats.org/officeDocument/2006/customXml" ds:itemID="{FACB83BB-458E-4CCB-91D7-35CFBA93934D}">
+  <ds:schemaRefs>
+    <ds:schemaRef ds:uri="http://schemas.openxmlformats.org/officeDocument/2006/bibliography"/>
+  </ds:schemaRefs>
+</ds:datastoreItem>
+</file>
+
+<file path=customXml/itemProps2.xml><?xml version="1.0" encoding="utf-8"?>
 <ds:datastoreItem xmlns:ds="http://schemas.openxmlformats.org/officeDocument/2006/customXml" ds:itemID="{084C26D9-49C9-4ADB-A387-DA6079798921}">
   <ds:schemaRefs>
     <ds:schemaRef ds:uri="http://schemas.microsoft.com/sharepoint/v3/contenttype/forms"/>
@@ -19559,25 +19517,7 @@
 </ds:datastoreItem>
 </file>
 
-<file path=customXml/itemProps2.xml><?xml version="1.0" encoding="utf-8"?>
-<ds:datastoreItem xmlns:ds="http://schemas.openxmlformats.org/officeDocument/2006/customXml" ds:itemID="{FACB83BB-458E-4CCB-91D7-35CFBA93934D}">
-  <ds:schemaRefs>
-    <ds:schemaRef ds:uri="http://schemas.openxmlformats.org/officeDocument/2006/bibliography"/>
-  </ds:schemaRefs>
-</ds:datastoreItem>
-</file>
-
 <file path=customXml/itemProps3.xml><?xml version="1.0" encoding="utf-8"?>
-<ds:datastoreItem xmlns:ds="http://schemas.openxmlformats.org/officeDocument/2006/customXml" ds:itemID="{662F60C8-4BC5-4139-BE63-6954D22D77BD}">
-  <ds:schemaRefs>
-    <ds:schemaRef ds:uri="http://schemas.microsoft.com/office/2006/metadata/properties"/>
-    <ds:schemaRef ds:uri="http://schemas.microsoft.com/office/infopath/2007/PartnerControls"/>
-    <ds:schemaRef ds:uri="0a2fff00-f002-44e7-b50c-b90cb65110b9"/>
-  </ds:schemaRefs>
-</ds:datastoreItem>
-</file>
-
-<file path=customXml/itemProps4.xml><?xml version="1.0" encoding="utf-8"?>
 <ds:datastoreItem xmlns:ds="http://schemas.openxmlformats.org/officeDocument/2006/customXml" ds:itemID="{CE4EBACF-5594-46F9-A2CF-C5555F399E1E}">
   <ds:schemaRefs>
     <ds:schemaRef ds:uri="http://schemas.microsoft.com/office/2006/metadata/contentType"/>
@@ -19593,4 +19533,14 @@
     <ds:schemaRef ds:uri="http://schemas.microsoft.com/internal/obd"/>
   </ds:schemaRefs>
 </ds:datastoreItem>
+</file>
+
+<file path=customXml/itemProps4.xml><?xml version="1.0" encoding="utf-8"?>
+<ds:datastoreItem xmlns:ds="http://schemas.openxmlformats.org/officeDocument/2006/customXml" ds:itemID="{662F60C8-4BC5-4139-BE63-6954D22D77BD}">
+  <ds:schemaRefs>
+    <ds:schemaRef ds:uri="http://schemas.microsoft.com/office/2006/metadata/properties"/>
+    <ds:schemaRef ds:uri="http://schemas.microsoft.com/office/infopath/2007/PartnerControls"/>
+    <ds:schemaRef ds:uri="0a2fff00-f002-44e7-b50c-b90cb65110b9"/>
+  </ds:schemaRefs>
+</ds:datastoreItem>
 </file>
</xml_diff>